<commit_message>
Referensi Jaga Shift Done
Jadwal Dinas
</commit_message>
<xml_diff>
--- a/project/kepegawaian/AddonSimrsmu.docx
+++ b/project/kepegawaian/AddonSimrsmu.docx
@@ -1441,11 +1441,13 @@
           <w:numId w:val="1"/>
         </w:numPr>
         <w:rPr>
-          <w:lang w:val="en-US"/>
-        </w:rPr>
-      </w:pPr>
-      <w:r>
-        <w:rPr>
+          <w:strike/>
+          <w:lang w:val="en-US"/>
+        </w:rPr>
+      </w:pPr>
+      <w:r>
+        <w:rPr>
+          <w:strike/>
           <w:lang w:val="en-US"/>
         </w:rPr>
         <w:t xml:space="preserve">Upload STR </w:t>
@@ -1453,6 +1455,7 @@
       <w:proofErr w:type="spellStart"/>
       <w:r>
         <w:rPr>
+          <w:strike/>
           <w:lang w:val="en-US"/>
         </w:rPr>
         <w:t>Seumur</w:t>
@@ -1460,13 +1463,15 @@
       <w:proofErr w:type="spellEnd"/>
       <w:r>
         <w:rPr>
-          <w:lang w:val="en-US"/>
-        </w:rPr>
-        <w:t xml:space="preserve"> </w:t>
-      </w:r>
-      <w:proofErr w:type="spellStart"/>
-      <w:r>
-        <w:rPr>
+          <w:strike/>
+          <w:lang w:val="en-US"/>
+        </w:rPr>
+        <w:t xml:space="preserve"> </w:t>
+      </w:r>
+      <w:proofErr w:type="spellStart"/>
+      <w:r>
+        <w:rPr>
+          <w:strike/>
           <w:lang w:val="en-US"/>
         </w:rPr>
         <w:t>hidup</w:t>
@@ -1474,13 +1479,15 @@
       <w:proofErr w:type="spellEnd"/>
       <w:r>
         <w:rPr>
-          <w:lang w:val="en-US"/>
-        </w:rPr>
-        <w:t xml:space="preserve"> </w:t>
-      </w:r>
-      <w:proofErr w:type="spellStart"/>
-      <w:r>
-        <w:rPr>
+          <w:strike/>
+          <w:lang w:val="en-US"/>
+        </w:rPr>
+        <w:t xml:space="preserve"> </w:t>
+      </w:r>
+      <w:proofErr w:type="spellStart"/>
+      <w:r>
+        <w:rPr>
+          <w:strike/>
           <w:lang w:val="en-US"/>
         </w:rPr>
         <w:t>dapat</w:t>
@@ -1488,6 +1495,7 @@
       <w:proofErr w:type="spellEnd"/>
       <w:r>
         <w:rPr>
+          <w:strike/>
           <w:lang w:val="en-US"/>
         </w:rPr>
         <w:t xml:space="preserve"> upload </w:t>
@@ -1495,6 +1503,7 @@
       <w:proofErr w:type="spellStart"/>
       <w:r>
         <w:rPr>
+          <w:strike/>
           <w:lang w:val="en-US"/>
         </w:rPr>
         <w:t>dokumen</w:t>
@@ -1843,12 +1852,14 @@
           <w:numId w:val="1"/>
         </w:numPr>
         <w:rPr>
-          <w:lang w:val="en-US"/>
-        </w:rPr>
-      </w:pPr>
-      <w:proofErr w:type="spellStart"/>
-      <w:r>
-        <w:rPr>
+          <w:strike/>
+          <w:lang w:val="en-US"/>
+        </w:rPr>
+      </w:pPr>
+      <w:proofErr w:type="spellStart"/>
+      <w:r>
+        <w:rPr>
+          <w:strike/>
           <w:lang w:val="en-US"/>
         </w:rPr>
         <w:t>dapat</w:t>
@@ -1856,13 +1867,15 @@
       <w:proofErr w:type="spellEnd"/>
       <w:r>
         <w:rPr>
-          <w:lang w:val="en-US"/>
-        </w:rPr>
-        <w:t xml:space="preserve"> </w:t>
-      </w:r>
-      <w:proofErr w:type="spellStart"/>
-      <w:r>
-        <w:rPr>
+          <w:strike/>
+          <w:lang w:val="en-US"/>
+        </w:rPr>
+        <w:t xml:space="preserve"> </w:t>
+      </w:r>
+      <w:proofErr w:type="spellStart"/>
+      <w:r>
+        <w:rPr>
+          <w:strike/>
           <w:lang w:val="en-US"/>
         </w:rPr>
         <w:t>didownload</w:t>
@@ -1870,13 +1883,15 @@
       <w:proofErr w:type="spellEnd"/>
       <w:r>
         <w:rPr>
-          <w:lang w:val="en-US"/>
-        </w:rPr>
-        <w:t xml:space="preserve"> </w:t>
-      </w:r>
-      <w:proofErr w:type="spellStart"/>
-      <w:r>
-        <w:rPr>
+          <w:strike/>
+          <w:lang w:val="en-US"/>
+        </w:rPr>
+        <w:t xml:space="preserve"> </w:t>
+      </w:r>
+      <w:proofErr w:type="spellStart"/>
+      <w:r>
+        <w:rPr>
+          <w:strike/>
           <w:lang w:val="en-US"/>
         </w:rPr>
         <w:t>semua</w:t>
@@ -1884,6 +1899,7 @@
       <w:proofErr w:type="spellEnd"/>
       <w:r>
         <w:rPr>
+          <w:strike/>
           <w:lang w:val="en-US"/>
         </w:rPr>
         <w:t xml:space="preserve"> orang</w:t>
@@ -1986,253 +2002,35 @@
           <w:numId w:val="1"/>
         </w:numPr>
         <w:rPr>
-          <w:lang w:val="en-US"/>
-        </w:rPr>
-      </w:pPr>
-      <w:proofErr w:type="spellStart"/>
-      <w:r>
-        <w:rPr>
-          <w:lang w:val="en-US"/>
-        </w:rPr>
-        <w:t>Perubahan</w:t>
-      </w:r>
-      <w:proofErr w:type="spellEnd"/>
-      <w:r>
-        <w:rPr>
-          <w:lang w:val="en-US"/>
-        </w:rPr>
-        <w:t xml:space="preserve"> </w:t>
-      </w:r>
-      <w:proofErr w:type="spellStart"/>
-      <w:r>
-        <w:rPr>
-          <w:lang w:val="en-US"/>
-        </w:rPr>
-        <w:t>jadwal</w:t>
-      </w:r>
-      <w:proofErr w:type="spellEnd"/>
-      <w:r>
-        <w:rPr>
-          <w:lang w:val="en-US"/>
-        </w:rPr>
-        <w:t xml:space="preserve"> </w:t>
-      </w:r>
-      <w:r>
-        <w:rPr>
-          <w:lang w:val="en-US"/>
-        </w:rPr>
-        <w:t>(</w:t>
-      </w:r>
-      <w:proofErr w:type="spellStart"/>
-      <w:r>
-        <w:rPr>
-          <w:lang w:val="en-US"/>
-        </w:rPr>
-        <w:t>tukar</w:t>
-      </w:r>
-      <w:proofErr w:type="spellEnd"/>
-      <w:r>
-        <w:rPr>
-          <w:lang w:val="en-US"/>
-        </w:rPr>
-        <w:t xml:space="preserve"> </w:t>
-      </w:r>
-      <w:proofErr w:type="spellStart"/>
-      <w:r>
-        <w:rPr>
-          <w:lang w:val="en-US"/>
-        </w:rPr>
-        <w:t>jadwal</w:t>
-      </w:r>
-      <w:proofErr w:type="spellEnd"/>
-      <w:r>
-        <w:rPr>
-          <w:lang w:val="en-US"/>
-        </w:rPr>
-        <w:t xml:space="preserve">) </w:t>
-      </w:r>
-      <w:proofErr w:type="spellStart"/>
-      <w:r>
-        <w:rPr>
-          <w:lang w:val="en-US"/>
-        </w:rPr>
-        <w:t>hanya</w:t>
-      </w:r>
-      <w:proofErr w:type="spellEnd"/>
-      <w:r>
-        <w:rPr>
-          <w:lang w:val="en-US"/>
-        </w:rPr>
-        <w:t xml:space="preserve"> </w:t>
-      </w:r>
-      <w:proofErr w:type="spellStart"/>
-      <w:r>
-        <w:rPr>
-          <w:lang w:val="en-US"/>
-        </w:rPr>
-        <w:t>dilakukan</w:t>
-      </w:r>
-      <w:proofErr w:type="spellEnd"/>
-      <w:r>
-        <w:rPr>
-          <w:lang w:val="en-US"/>
-        </w:rPr>
-        <w:t xml:space="preserve"> oleh </w:t>
-      </w:r>
-      <w:proofErr w:type="spellStart"/>
-      <w:r>
-        <w:rPr>
-          <w:lang w:val="en-US"/>
-        </w:rPr>
-        <w:t>kepegawaian</w:t>
-      </w:r>
-      <w:proofErr w:type="spellEnd"/>
-      <w:r>
-        <w:rPr>
-          <w:lang w:val="en-US"/>
-        </w:rPr>
-        <w:t xml:space="preserve"> (</w:t>
-      </w:r>
-      <w:proofErr w:type="spellStart"/>
-      <w:r>
-        <w:rPr>
-          <w:lang w:val="en-US"/>
-        </w:rPr>
-        <w:t>pegawai</w:t>
-      </w:r>
-      <w:proofErr w:type="spellEnd"/>
-      <w:r>
-        <w:rPr>
-          <w:lang w:val="en-US"/>
-        </w:rPr>
-        <w:t xml:space="preserve"> </w:t>
-      </w:r>
-      <w:proofErr w:type="spellStart"/>
-      <w:r>
-        <w:rPr>
-          <w:lang w:val="en-US"/>
-        </w:rPr>
-        <w:t>tidak</w:t>
-      </w:r>
-      <w:proofErr w:type="spellEnd"/>
-      <w:r>
-        <w:rPr>
-          <w:lang w:val="en-US"/>
-        </w:rPr>
-        <w:t xml:space="preserve"> </w:t>
-      </w:r>
-      <w:proofErr w:type="spellStart"/>
-      <w:r>
-        <w:rPr>
-          <w:lang w:val="en-US"/>
-        </w:rPr>
-        <w:t>dapat</w:t>
-      </w:r>
-      <w:proofErr w:type="spellEnd"/>
-      <w:r>
-        <w:rPr>
-          <w:lang w:val="en-US"/>
-        </w:rPr>
-        <w:t xml:space="preserve"> </w:t>
-      </w:r>
-      <w:proofErr w:type="spellStart"/>
-      <w:r>
-        <w:rPr>
-          <w:lang w:val="en-US"/>
-        </w:rPr>
-        <w:t>merubah</w:t>
-      </w:r>
-      <w:proofErr w:type="spellEnd"/>
-      <w:r>
-        <w:rPr>
-          <w:lang w:val="en-US"/>
-        </w:rPr>
-        <w:t xml:space="preserve"> </w:t>
-      </w:r>
-      <w:proofErr w:type="spellStart"/>
-      <w:r>
-        <w:rPr>
-          <w:lang w:val="en-US"/>
-        </w:rPr>
-        <w:t>jadwal</w:t>
-      </w:r>
-      <w:proofErr w:type="spellEnd"/>
-      <w:r>
-        <w:rPr>
-          <w:lang w:val="en-US"/>
-        </w:rPr>
-        <w:t xml:space="preserve"> </w:t>
-      </w:r>
-      <w:proofErr w:type="spellStart"/>
-      <w:r>
-        <w:rPr>
-          <w:lang w:val="en-US"/>
-        </w:rPr>
-        <w:t>yg</w:t>
-      </w:r>
-      <w:proofErr w:type="spellEnd"/>
-      <w:r>
-        <w:rPr>
-          <w:lang w:val="en-US"/>
-        </w:rPr>
-        <w:t xml:space="preserve"> </w:t>
-      </w:r>
-      <w:proofErr w:type="spellStart"/>
-      <w:r>
-        <w:rPr>
-          <w:lang w:val="en-US"/>
-        </w:rPr>
-        <w:t>sudah</w:t>
-      </w:r>
-      <w:proofErr w:type="spellEnd"/>
-      <w:r>
-        <w:rPr>
-          <w:lang w:val="en-US"/>
-        </w:rPr>
-        <w:t xml:space="preserve"> di </w:t>
-      </w:r>
-      <w:proofErr w:type="spellStart"/>
-      <w:r>
-        <w:rPr>
-          <w:lang w:val="en-US"/>
-        </w:rPr>
-        <w:t>verif</w:t>
-      </w:r>
-      <w:proofErr w:type="spellEnd"/>
-      <w:r>
-        <w:rPr>
-          <w:lang w:val="en-US"/>
-        </w:rPr>
-        <w:t xml:space="preserve"> </w:t>
-      </w:r>
-      <w:proofErr w:type="spellStart"/>
-      <w:r>
-        <w:rPr>
-          <w:lang w:val="en-US"/>
-        </w:rPr>
-        <w:t>dari</w:t>
-      </w:r>
-      <w:proofErr w:type="spellEnd"/>
-      <w:r>
-        <w:rPr>
-          <w:lang w:val="en-US"/>
-        </w:rPr>
-        <w:t xml:space="preserve"> </w:t>
-      </w:r>
-      <w:proofErr w:type="spellStart"/>
-      <w:r>
-        <w:rPr>
-          <w:lang w:val="en-US"/>
-        </w:rPr>
-        <w:t>kepegawaian</w:t>
-      </w:r>
-      <w:proofErr w:type="spellEnd"/>
-      <w:r>
-        <w:rPr>
-          <w:lang w:val="en-US"/>
-        </w:rPr>
-        <w:t>)</w:t>
-      </w:r>
+          <w:strike/>
+          <w:lang w:val="en-US"/>
+        </w:rPr>
+      </w:pPr>
+      <w:proofErr w:type="spellStart"/>
+      <w:r>
+        <w:rPr>
+          <w:strike/>
+          <w:lang w:val="en-US"/>
+        </w:rPr>
+        <w:t>Referensi</w:t>
+      </w:r>
+      <w:proofErr w:type="spellEnd"/>
+      <w:r>
+        <w:rPr>
+          <w:strike/>
+          <w:lang w:val="en-US"/>
+        </w:rPr>
+        <w:t xml:space="preserve"> Jaga Shift </w:t>
+      </w:r>
+      <w:proofErr w:type="spellStart"/>
+      <w:r>
+        <w:rPr>
+          <w:strike/>
+          <w:lang w:val="en-US"/>
+        </w:rPr>
+        <w:t>diselesaikan</w:t>
+      </w:r>
+      <w:proofErr w:type="spellEnd"/>
     </w:p>
     <w:p>
       <w:pPr>
@@ -2242,141 +2040,49 @@
           <w:numId w:val="1"/>
         </w:numPr>
         <w:rPr>
-          <w:lang w:val="en-US"/>
-        </w:rPr>
-      </w:pPr>
-      <w:proofErr w:type="spellStart"/>
-      <w:r>
-        <w:rPr>
-          <w:lang w:val="en-US"/>
-        </w:rPr>
-        <w:t>Apabila</w:t>
-      </w:r>
-      <w:proofErr w:type="spellEnd"/>
-      <w:r>
-        <w:rPr>
-          <w:lang w:val="en-US"/>
-        </w:rPr>
-        <w:t xml:space="preserve"> </w:t>
-      </w:r>
-      <w:proofErr w:type="spellStart"/>
-      <w:r>
-        <w:rPr>
-          <w:lang w:val="en-US"/>
-        </w:rPr>
-        <w:t>ada</w:t>
-      </w:r>
-      <w:proofErr w:type="spellEnd"/>
-      <w:r>
-        <w:rPr>
-          <w:lang w:val="en-US"/>
-        </w:rPr>
-        <w:t xml:space="preserve"> </w:t>
-      </w:r>
-      <w:proofErr w:type="spellStart"/>
-      <w:r>
-        <w:rPr>
-          <w:lang w:val="en-US"/>
-        </w:rPr>
-        <w:t>perubahan</w:t>
-      </w:r>
-      <w:proofErr w:type="spellEnd"/>
-      <w:r>
-        <w:rPr>
-          <w:lang w:val="en-US"/>
-        </w:rPr>
-        <w:t xml:space="preserve"> </w:t>
-      </w:r>
-      <w:proofErr w:type="spellStart"/>
-      <w:r>
-        <w:rPr>
-          <w:lang w:val="en-US"/>
-        </w:rPr>
-        <w:t>jadwal</w:t>
-      </w:r>
-      <w:proofErr w:type="spellEnd"/>
-      <w:r>
-        <w:rPr>
-          <w:lang w:val="en-US"/>
-        </w:rPr>
-        <w:t xml:space="preserve"> (</w:t>
-      </w:r>
-      <w:proofErr w:type="spellStart"/>
-      <w:r>
-        <w:rPr>
-          <w:lang w:val="en-US"/>
-        </w:rPr>
-        <w:t>verif</w:t>
-      </w:r>
-      <w:proofErr w:type="spellEnd"/>
-      <w:r>
-        <w:rPr>
-          <w:lang w:val="en-US"/>
-        </w:rPr>
-        <w:t xml:space="preserve"> </w:t>
-      </w:r>
-      <w:proofErr w:type="spellStart"/>
-      <w:r>
-        <w:rPr>
-          <w:lang w:val="en-US"/>
-        </w:rPr>
-        <w:t>atau</w:t>
-      </w:r>
-      <w:proofErr w:type="spellEnd"/>
-      <w:r>
-        <w:rPr>
-          <w:lang w:val="en-US"/>
-        </w:rPr>
-        <w:t xml:space="preserve"> </w:t>
-      </w:r>
-      <w:proofErr w:type="spellStart"/>
-      <w:r>
-        <w:rPr>
-          <w:lang w:val="en-US"/>
-        </w:rPr>
-        <w:t>belum</w:t>
-      </w:r>
-      <w:proofErr w:type="spellEnd"/>
-      <w:r>
-        <w:rPr>
-          <w:lang w:val="en-US"/>
-        </w:rPr>
-        <w:t xml:space="preserve">), </w:t>
-      </w:r>
-      <w:proofErr w:type="spellStart"/>
-      <w:r>
-        <w:rPr>
-          <w:lang w:val="en-US"/>
-        </w:rPr>
-        <w:t>notifikasi</w:t>
-      </w:r>
-      <w:proofErr w:type="spellEnd"/>
-      <w:r>
-        <w:rPr>
-          <w:lang w:val="en-US"/>
-        </w:rPr>
-        <w:t xml:space="preserve"> </w:t>
-      </w:r>
-      <w:proofErr w:type="spellStart"/>
-      <w:r>
-        <w:rPr>
-          <w:lang w:val="en-US"/>
-        </w:rPr>
-        <w:t>ke</w:t>
-      </w:r>
-      <w:proofErr w:type="spellEnd"/>
-      <w:r>
-        <w:rPr>
-          <w:lang w:val="en-US"/>
-        </w:rPr>
-        <w:t xml:space="preserve"> </w:t>
-      </w:r>
-      <w:proofErr w:type="spellStart"/>
-      <w:r>
-        <w:rPr>
-          <w:lang w:val="en-US"/>
-        </w:rPr>
-        <w:t>kepegawaian</w:t>
+          <w:strike/>
+          <w:lang w:val="en-US"/>
+        </w:rPr>
+      </w:pPr>
+      <w:proofErr w:type="spellStart"/>
+      <w:r>
+        <w:rPr>
+          <w:strike/>
+          <w:lang w:val="en-US"/>
+        </w:rPr>
+        <w:t>Referensi</w:t>
+      </w:r>
+      <w:proofErr w:type="spellEnd"/>
+      <w:r>
+        <w:rPr>
+          <w:strike/>
+          <w:lang w:val="en-US"/>
+        </w:rPr>
+        <w:t xml:space="preserve"> </w:t>
+      </w:r>
+      <w:proofErr w:type="spellStart"/>
+      <w:r>
+        <w:rPr>
+          <w:strike/>
+          <w:lang w:val="en-US"/>
+        </w:rPr>
+        <w:t>Staf</w:t>
+      </w:r>
+      <w:proofErr w:type="spellEnd"/>
+      <w:r>
+        <w:rPr>
+          <w:strike/>
+          <w:lang w:val="en-US"/>
+        </w:rPr>
+        <w:t xml:space="preserve"> </w:t>
+      </w:r>
+      <w:proofErr w:type="spellStart"/>
+      <w:r>
+        <w:rPr>
+          <w:strike/>
+          <w:lang w:val="en-US"/>
+        </w:rPr>
+        <w:t>diselesaikan</w:t>
       </w:r>
       <w:proofErr w:type="spellEnd"/>
     </w:p>
@@ -2388,78 +2094,228 @@
           <w:numId w:val="1"/>
         </w:numPr>
         <w:rPr>
-          <w:strike/>
-          <w:lang w:val="en-US"/>
-        </w:rPr>
-      </w:pPr>
-      <w:proofErr w:type="spellStart"/>
-      <w:r>
-        <w:rPr>
-          <w:strike/>
-          <w:lang w:val="en-US"/>
-        </w:rPr>
-        <w:t>Tambah</w:t>
-      </w:r>
-      <w:proofErr w:type="spellEnd"/>
-      <w:r>
-        <w:rPr>
-          <w:strike/>
-          <w:lang w:val="en-US"/>
-        </w:rPr>
-        <w:t xml:space="preserve"> </w:t>
-      </w:r>
-      <w:proofErr w:type="spellStart"/>
-      <w:r>
-        <w:rPr>
-          <w:strike/>
-          <w:lang w:val="en-US"/>
-        </w:rPr>
-        <w:t>lampiran</w:t>
-      </w:r>
-      <w:proofErr w:type="spellEnd"/>
-      <w:r>
-        <w:rPr>
-          <w:strike/>
-          <w:lang w:val="en-US"/>
-        </w:rPr>
-        <w:t xml:space="preserve"> </w:t>
-      </w:r>
-      <w:proofErr w:type="spellStart"/>
-      <w:r>
-        <w:rPr>
-          <w:strike/>
-          <w:lang w:val="en-US"/>
-        </w:rPr>
-        <w:t>kwitansi</w:t>
-      </w:r>
-      <w:proofErr w:type="spellEnd"/>
-      <w:r>
-        <w:rPr>
-          <w:strike/>
-          <w:lang w:val="en-US"/>
-        </w:rPr>
-        <w:t xml:space="preserve"> </w:t>
-      </w:r>
-      <w:proofErr w:type="spellStart"/>
-      <w:r>
-        <w:rPr>
-          <w:strike/>
-          <w:lang w:val="en-US"/>
-        </w:rPr>
-        <w:t>pembayaran</w:t>
-      </w:r>
-      <w:proofErr w:type="spellEnd"/>
-      <w:r>
-        <w:rPr>
-          <w:strike/>
-          <w:lang w:val="en-US"/>
-        </w:rPr>
-        <w:t xml:space="preserve"> </w:t>
-      </w:r>
-      <w:proofErr w:type="spellStart"/>
-      <w:r>
-        <w:rPr>
-          <w:strike/>
+          <w:lang w:val="en-US"/>
+        </w:rPr>
+      </w:pPr>
+      <w:proofErr w:type="spellStart"/>
+      <w:r>
+        <w:rPr>
+          <w:lang w:val="en-US"/>
+        </w:rPr>
+        <w:t>Perubahan</w:t>
+      </w:r>
+      <w:proofErr w:type="spellEnd"/>
+      <w:r>
+        <w:rPr>
+          <w:lang w:val="en-US"/>
+        </w:rPr>
+        <w:t xml:space="preserve"> </w:t>
+      </w:r>
+      <w:proofErr w:type="spellStart"/>
+      <w:r>
+        <w:rPr>
+          <w:lang w:val="en-US"/>
+        </w:rPr>
+        <w:t>jadwal</w:t>
+      </w:r>
+      <w:proofErr w:type="spellEnd"/>
+      <w:r>
+        <w:rPr>
+          <w:lang w:val="en-US"/>
+        </w:rPr>
+        <w:t xml:space="preserve"> </w:t>
+      </w:r>
+      <w:r>
+        <w:rPr>
+          <w:lang w:val="en-US"/>
+        </w:rPr>
+        <w:t>(</w:t>
+      </w:r>
+      <w:proofErr w:type="spellStart"/>
+      <w:r>
+        <w:rPr>
+          <w:lang w:val="en-US"/>
+        </w:rPr>
+        <w:t>tukar</w:t>
+      </w:r>
+      <w:proofErr w:type="spellEnd"/>
+      <w:r>
+        <w:rPr>
+          <w:lang w:val="en-US"/>
+        </w:rPr>
+        <w:t xml:space="preserve"> </w:t>
+      </w:r>
+      <w:proofErr w:type="spellStart"/>
+      <w:r>
+        <w:rPr>
+          <w:lang w:val="en-US"/>
+        </w:rPr>
+        <w:t>jadwal</w:t>
+      </w:r>
+      <w:proofErr w:type="spellEnd"/>
+      <w:r>
+        <w:rPr>
+          <w:lang w:val="en-US"/>
+        </w:rPr>
+        <w:t xml:space="preserve">) </w:t>
+      </w:r>
+      <w:proofErr w:type="spellStart"/>
+      <w:r>
+        <w:rPr>
+          <w:lang w:val="en-US"/>
+        </w:rPr>
+        <w:t>hanya</w:t>
+      </w:r>
+      <w:proofErr w:type="spellEnd"/>
+      <w:r>
+        <w:rPr>
+          <w:lang w:val="en-US"/>
+        </w:rPr>
+        <w:t xml:space="preserve"> </w:t>
+      </w:r>
+      <w:proofErr w:type="spellStart"/>
+      <w:r>
+        <w:rPr>
+          <w:lang w:val="en-US"/>
+        </w:rPr>
+        <w:t>dilakukan</w:t>
+      </w:r>
+      <w:proofErr w:type="spellEnd"/>
+      <w:r>
+        <w:rPr>
+          <w:lang w:val="en-US"/>
+        </w:rPr>
+        <w:t xml:space="preserve"> oleh </w:t>
+      </w:r>
+      <w:proofErr w:type="spellStart"/>
+      <w:r>
+        <w:rPr>
+          <w:lang w:val="en-US"/>
+        </w:rPr>
+        <w:t>kepegawaian</w:t>
+      </w:r>
+      <w:proofErr w:type="spellEnd"/>
+      <w:r>
+        <w:rPr>
+          <w:lang w:val="en-US"/>
+        </w:rPr>
+        <w:t xml:space="preserve"> (</w:t>
+      </w:r>
+      <w:proofErr w:type="spellStart"/>
+      <w:r>
+        <w:rPr>
+          <w:lang w:val="en-US"/>
+        </w:rPr>
+        <w:t>pegawai</w:t>
+      </w:r>
+      <w:proofErr w:type="spellEnd"/>
+      <w:r>
+        <w:rPr>
+          <w:lang w:val="en-US"/>
+        </w:rPr>
+        <w:t xml:space="preserve"> </w:t>
+      </w:r>
+      <w:proofErr w:type="spellStart"/>
+      <w:r>
+        <w:rPr>
+          <w:lang w:val="en-US"/>
+        </w:rPr>
+        <w:t>tidak</w:t>
+      </w:r>
+      <w:proofErr w:type="spellEnd"/>
+      <w:r>
+        <w:rPr>
+          <w:lang w:val="en-US"/>
+        </w:rPr>
+        <w:t xml:space="preserve"> </w:t>
+      </w:r>
+      <w:proofErr w:type="spellStart"/>
+      <w:r>
+        <w:rPr>
+          <w:lang w:val="en-US"/>
+        </w:rPr>
+        <w:t>dapat</w:t>
+      </w:r>
+      <w:proofErr w:type="spellEnd"/>
+      <w:r>
+        <w:rPr>
+          <w:lang w:val="en-US"/>
+        </w:rPr>
+        <w:t xml:space="preserve"> </w:t>
+      </w:r>
+      <w:proofErr w:type="spellStart"/>
+      <w:r>
+        <w:rPr>
+          <w:lang w:val="en-US"/>
+        </w:rPr>
+        <w:t>merubah</w:t>
+      </w:r>
+      <w:proofErr w:type="spellEnd"/>
+      <w:r>
+        <w:rPr>
+          <w:lang w:val="en-US"/>
+        </w:rPr>
+        <w:t xml:space="preserve"> </w:t>
+      </w:r>
+      <w:proofErr w:type="spellStart"/>
+      <w:r>
+        <w:rPr>
+          <w:lang w:val="en-US"/>
+        </w:rPr>
+        <w:t>jadwal</w:t>
+      </w:r>
+      <w:proofErr w:type="spellEnd"/>
+      <w:r>
+        <w:rPr>
+          <w:lang w:val="en-US"/>
+        </w:rPr>
+        <w:t xml:space="preserve"> </w:t>
+      </w:r>
+      <w:proofErr w:type="spellStart"/>
+      <w:r>
+        <w:rPr>
+          <w:lang w:val="en-US"/>
+        </w:rPr>
+        <w:t>yg</w:t>
+      </w:r>
+      <w:proofErr w:type="spellEnd"/>
+      <w:r>
+        <w:rPr>
+          <w:lang w:val="en-US"/>
+        </w:rPr>
+        <w:t xml:space="preserve"> </w:t>
+      </w:r>
+      <w:proofErr w:type="spellStart"/>
+      <w:r>
+        <w:rPr>
+          <w:lang w:val="en-US"/>
+        </w:rPr>
+        <w:t>sudah</w:t>
+      </w:r>
+      <w:proofErr w:type="spellEnd"/>
+      <w:r>
+        <w:rPr>
+          <w:lang w:val="en-US"/>
+        </w:rPr>
+        <w:t xml:space="preserve"> di </w:t>
+      </w:r>
+      <w:proofErr w:type="spellStart"/>
+      <w:r>
+        <w:rPr>
+          <w:lang w:val="en-US"/>
+        </w:rPr>
+        <w:t>verif</w:t>
+      </w:r>
+      <w:proofErr w:type="spellEnd"/>
+      <w:r>
+        <w:rPr>
+          <w:lang w:val="en-US"/>
+        </w:rPr>
+        <w:t xml:space="preserve"> </w:t>
+      </w:r>
+      <w:proofErr w:type="spellStart"/>
+      <w:r>
+        <w:rPr>
           <w:lang w:val="en-US"/>
         </w:rPr>
         <w:t>dari</w:t>
@@ -2467,26 +2323,23 @@
       <w:proofErr w:type="spellEnd"/>
       <w:r>
         <w:rPr>
-          <w:strike/>
-          <w:lang w:val="en-US"/>
-        </w:rPr>
-        <w:t xml:space="preserve"> </w:t>
-      </w:r>
-      <w:proofErr w:type="spellStart"/>
-      <w:r>
-        <w:rPr>
-          <w:strike/>
-          <w:lang w:val="en-US"/>
-        </w:rPr>
-        <w:t>kasir</w:t>
-      </w:r>
-      <w:proofErr w:type="spellEnd"/>
-      <w:r>
-        <w:rPr>
-          <w:strike/>
-          <w:lang w:val="en-US"/>
-        </w:rPr>
-        <w:t xml:space="preserve"> di IDCARD</w:t>
+          <w:lang w:val="en-US"/>
+        </w:rPr>
+        <w:t xml:space="preserve"> </w:t>
+      </w:r>
+      <w:proofErr w:type="spellStart"/>
+      <w:r>
+        <w:rPr>
+          <w:lang w:val="en-US"/>
+        </w:rPr>
+        <w:t>kepegawaian</w:t>
+      </w:r>
+      <w:proofErr w:type="spellEnd"/>
+      <w:r>
+        <w:rPr>
+          <w:lang w:val="en-US"/>
+        </w:rPr>
+        <w:t>)</w:t>
       </w:r>
     </w:p>
     <w:p>
@@ -2497,177 +2350,141 @@
           <w:numId w:val="1"/>
         </w:numPr>
         <w:rPr>
-          <w:strike/>
-          <w:lang w:val="en-US"/>
-        </w:rPr>
-      </w:pPr>
-      <w:proofErr w:type="spellStart"/>
-      <w:r>
-        <w:rPr>
-          <w:strike/>
-          <w:lang w:val="en-US"/>
-        </w:rPr>
-        <w:t>Perjalanan</w:t>
-      </w:r>
-      <w:proofErr w:type="spellEnd"/>
-      <w:r>
-        <w:rPr>
-          <w:strike/>
-          <w:lang w:val="en-US"/>
-        </w:rPr>
-        <w:t xml:space="preserve"> Dinas </w:t>
-      </w:r>
-      <w:proofErr w:type="spellStart"/>
-      <w:r>
-        <w:rPr>
-          <w:strike/>
-          <w:lang w:val="en-US"/>
-        </w:rPr>
-        <w:t>kurang</w:t>
-      </w:r>
-      <w:proofErr w:type="spellEnd"/>
-      <w:r>
-        <w:rPr>
-          <w:strike/>
-          <w:lang w:val="en-US"/>
-        </w:rPr>
-        <w:t xml:space="preserve"> </w:t>
-      </w:r>
-      <w:proofErr w:type="spellStart"/>
-      <w:proofErr w:type="gramStart"/>
-      <w:r>
-        <w:rPr>
-          <w:strike/>
-          <w:lang w:val="en-US"/>
-        </w:rPr>
-        <w:t>isian</w:t>
-      </w:r>
-      <w:proofErr w:type="spellEnd"/>
-      <w:r>
-        <w:rPr>
-          <w:strike/>
-          <w:lang w:val="en-US"/>
-        </w:rPr>
-        <w:t xml:space="preserve"> :</w:t>
-      </w:r>
-      <w:proofErr w:type="gramEnd"/>
-      <w:r>
-        <w:rPr>
-          <w:strike/>
-          <w:lang w:val="en-US"/>
-        </w:rPr>
-        <w:t xml:space="preserve"> </w:t>
-      </w:r>
-      <w:proofErr w:type="spellStart"/>
-      <w:r>
-        <w:rPr>
-          <w:strike/>
-          <w:lang w:val="en-US"/>
-        </w:rPr>
-        <w:t>kendaraan</w:t>
-      </w:r>
-      <w:proofErr w:type="spellEnd"/>
-      <w:r>
-        <w:rPr>
-          <w:strike/>
-          <w:lang w:val="en-US"/>
-        </w:rPr>
-        <w:t xml:space="preserve"> </w:t>
-      </w:r>
-      <w:proofErr w:type="spellStart"/>
-      <w:r>
-        <w:rPr>
-          <w:strike/>
-          <w:lang w:val="en-US"/>
-        </w:rPr>
-        <w:t>yg</w:t>
-      </w:r>
-      <w:proofErr w:type="spellEnd"/>
-      <w:r>
-        <w:rPr>
-          <w:strike/>
-          <w:lang w:val="en-US"/>
-        </w:rPr>
-        <w:t xml:space="preserve"> </w:t>
-      </w:r>
-      <w:proofErr w:type="spellStart"/>
-      <w:r>
-        <w:rPr>
-          <w:strike/>
-          <w:lang w:val="en-US"/>
-        </w:rPr>
-        <w:t>digunakan</w:t>
-      </w:r>
-      <w:proofErr w:type="spellEnd"/>
-      <w:r>
-        <w:rPr>
-          <w:strike/>
-          <w:lang w:val="en-US"/>
-        </w:rPr>
-        <w:t xml:space="preserve">, lama </w:t>
-      </w:r>
-      <w:proofErr w:type="spellStart"/>
-      <w:r>
-        <w:rPr>
-          <w:strike/>
-          <w:lang w:val="en-US"/>
-        </w:rPr>
-        <w:t>tugas</w:t>
-      </w:r>
-      <w:proofErr w:type="spellEnd"/>
-      <w:r>
-        <w:rPr>
-          <w:strike/>
-          <w:lang w:val="en-US"/>
-        </w:rPr>
-        <w:t xml:space="preserve"> </w:t>
-      </w:r>
-      <w:r>
-        <w:rPr>
-          <w:strike/>
-          <w:lang w:val="en-US"/>
-        </w:rPr>
-        <w:t xml:space="preserve">(&lt;4jam / &gt;4jam), </w:t>
-      </w:r>
-      <w:proofErr w:type="spellStart"/>
-      <w:r>
-        <w:rPr>
-          <w:strike/>
-          <w:lang w:val="en-US"/>
-        </w:rPr>
-        <w:t>keterangan</w:t>
-      </w:r>
-      <w:proofErr w:type="spellEnd"/>
-      <w:r>
-        <w:rPr>
-          <w:strike/>
-          <w:lang w:val="en-US"/>
-        </w:rPr>
-        <w:t>/</w:t>
-      </w:r>
-      <w:proofErr w:type="spellStart"/>
-      <w:r>
-        <w:rPr>
-          <w:strike/>
-          <w:lang w:val="en-US"/>
-        </w:rPr>
-        <w:t>deskripsi</w:t>
-      </w:r>
-      <w:proofErr w:type="spellEnd"/>
-      <w:r>
-        <w:rPr>
-          <w:strike/>
-          <w:lang w:val="en-US"/>
-        </w:rPr>
-        <w:t xml:space="preserve"> </w:t>
-      </w:r>
-      <w:proofErr w:type="spellStart"/>
-      <w:r>
-        <w:rPr>
-          <w:strike/>
-          <w:lang w:val="en-US"/>
-        </w:rPr>
-        <w:t>perjalanan</w:t>
+          <w:lang w:val="en-US"/>
+        </w:rPr>
+      </w:pPr>
+      <w:proofErr w:type="spellStart"/>
+      <w:r>
+        <w:rPr>
+          <w:lang w:val="en-US"/>
+        </w:rPr>
+        <w:t>Apabila</w:t>
+      </w:r>
+      <w:proofErr w:type="spellEnd"/>
+      <w:r>
+        <w:rPr>
+          <w:lang w:val="en-US"/>
+        </w:rPr>
+        <w:t xml:space="preserve"> </w:t>
+      </w:r>
+      <w:proofErr w:type="spellStart"/>
+      <w:r>
+        <w:rPr>
+          <w:lang w:val="en-US"/>
+        </w:rPr>
+        <w:t>ada</w:t>
+      </w:r>
+      <w:proofErr w:type="spellEnd"/>
+      <w:r>
+        <w:rPr>
+          <w:lang w:val="en-US"/>
+        </w:rPr>
+        <w:t xml:space="preserve"> </w:t>
+      </w:r>
+      <w:proofErr w:type="spellStart"/>
+      <w:r>
+        <w:rPr>
+          <w:lang w:val="en-US"/>
+        </w:rPr>
+        <w:t>perubahan</w:t>
+      </w:r>
+      <w:proofErr w:type="spellEnd"/>
+      <w:r>
+        <w:rPr>
+          <w:lang w:val="en-US"/>
+        </w:rPr>
+        <w:t xml:space="preserve"> </w:t>
+      </w:r>
+      <w:proofErr w:type="spellStart"/>
+      <w:r>
+        <w:rPr>
+          <w:lang w:val="en-US"/>
+        </w:rPr>
+        <w:t>jadwal</w:t>
+      </w:r>
+      <w:proofErr w:type="spellEnd"/>
+      <w:r>
+        <w:rPr>
+          <w:lang w:val="en-US"/>
+        </w:rPr>
+        <w:t xml:space="preserve"> (</w:t>
+      </w:r>
+      <w:proofErr w:type="spellStart"/>
+      <w:r>
+        <w:rPr>
+          <w:lang w:val="en-US"/>
+        </w:rPr>
+        <w:t>verif</w:t>
+      </w:r>
+      <w:proofErr w:type="spellEnd"/>
+      <w:r>
+        <w:rPr>
+          <w:lang w:val="en-US"/>
+        </w:rPr>
+        <w:t xml:space="preserve"> </w:t>
+      </w:r>
+      <w:proofErr w:type="spellStart"/>
+      <w:r>
+        <w:rPr>
+          <w:lang w:val="en-US"/>
+        </w:rPr>
+        <w:t>atau</w:t>
+      </w:r>
+      <w:proofErr w:type="spellEnd"/>
+      <w:r>
+        <w:rPr>
+          <w:lang w:val="en-US"/>
+        </w:rPr>
+        <w:t xml:space="preserve"> </w:t>
+      </w:r>
+      <w:proofErr w:type="spellStart"/>
+      <w:r>
+        <w:rPr>
+          <w:lang w:val="en-US"/>
+        </w:rPr>
+        <w:t>belum</w:t>
+      </w:r>
+      <w:proofErr w:type="spellEnd"/>
+      <w:r>
+        <w:rPr>
+          <w:lang w:val="en-US"/>
+        </w:rPr>
+        <w:t xml:space="preserve">), </w:t>
+      </w:r>
+      <w:proofErr w:type="spellStart"/>
+      <w:r>
+        <w:rPr>
+          <w:lang w:val="en-US"/>
+        </w:rPr>
+        <w:t>notifikasi</w:t>
+      </w:r>
+      <w:proofErr w:type="spellEnd"/>
+      <w:r>
+        <w:rPr>
+          <w:lang w:val="en-US"/>
+        </w:rPr>
+        <w:t xml:space="preserve"> </w:t>
+      </w:r>
+      <w:proofErr w:type="spellStart"/>
+      <w:r>
+        <w:rPr>
+          <w:lang w:val="en-US"/>
+        </w:rPr>
+        <w:t>ke</w:t>
+      </w:r>
+      <w:proofErr w:type="spellEnd"/>
+      <w:r>
+        <w:rPr>
+          <w:lang w:val="en-US"/>
+        </w:rPr>
+        <w:t xml:space="preserve"> </w:t>
+      </w:r>
+      <w:proofErr w:type="spellStart"/>
+      <w:r>
+        <w:rPr>
+          <w:lang w:val="en-US"/>
+        </w:rPr>
+        <w:t>kepegawaian</w:t>
       </w:r>
       <w:proofErr w:type="spellEnd"/>
     </w:p>
@@ -2689,41 +2506,96 @@
           <w:strike/>
           <w:lang w:val="en-US"/>
         </w:rPr>
-        <w:t>Perjalanan</w:t>
-      </w:r>
-      <w:proofErr w:type="spellEnd"/>
-      <w:r>
-        <w:rPr>
-          <w:strike/>
-          <w:lang w:val="en-US"/>
-        </w:rPr>
-        <w:t xml:space="preserve"> Dinas </w:t>
-      </w:r>
-      <w:proofErr w:type="spellStart"/>
-      <w:r>
-        <w:rPr>
-          <w:strike/>
-          <w:lang w:val="en-US"/>
-        </w:rPr>
-        <w:t>dihapus</w:t>
-      </w:r>
-      <w:proofErr w:type="spellEnd"/>
-      <w:r>
-        <w:rPr>
-          <w:strike/>
-          <w:lang w:val="en-US"/>
-        </w:rPr>
-        <w:t xml:space="preserve"> upload </w:t>
-      </w:r>
-      <w:proofErr w:type="spellStart"/>
-      <w:r>
-        <w:rPr>
-          <w:strike/>
-          <w:lang w:val="en-US"/>
-        </w:rPr>
-        <w:t>filenya</w:t>
-      </w:r>
-      <w:proofErr w:type="spellEnd"/>
+        <w:t>Tambah</w:t>
+      </w:r>
+      <w:proofErr w:type="spellEnd"/>
+      <w:r>
+        <w:rPr>
+          <w:strike/>
+          <w:lang w:val="en-US"/>
+        </w:rPr>
+        <w:t xml:space="preserve"> </w:t>
+      </w:r>
+      <w:proofErr w:type="spellStart"/>
+      <w:r>
+        <w:rPr>
+          <w:strike/>
+          <w:lang w:val="en-US"/>
+        </w:rPr>
+        <w:t>lampiran</w:t>
+      </w:r>
+      <w:proofErr w:type="spellEnd"/>
+      <w:r>
+        <w:rPr>
+          <w:strike/>
+          <w:lang w:val="en-US"/>
+        </w:rPr>
+        <w:t xml:space="preserve"> </w:t>
+      </w:r>
+      <w:proofErr w:type="spellStart"/>
+      <w:r>
+        <w:rPr>
+          <w:strike/>
+          <w:lang w:val="en-US"/>
+        </w:rPr>
+        <w:t>kwitansi</w:t>
+      </w:r>
+      <w:proofErr w:type="spellEnd"/>
+      <w:r>
+        <w:rPr>
+          <w:strike/>
+          <w:lang w:val="en-US"/>
+        </w:rPr>
+        <w:t xml:space="preserve"> </w:t>
+      </w:r>
+      <w:proofErr w:type="spellStart"/>
+      <w:r>
+        <w:rPr>
+          <w:strike/>
+          <w:lang w:val="en-US"/>
+        </w:rPr>
+        <w:t>pembayaran</w:t>
+      </w:r>
+      <w:proofErr w:type="spellEnd"/>
+      <w:r>
+        <w:rPr>
+          <w:strike/>
+          <w:lang w:val="en-US"/>
+        </w:rPr>
+        <w:t xml:space="preserve"> </w:t>
+      </w:r>
+      <w:proofErr w:type="spellStart"/>
+      <w:r>
+        <w:rPr>
+          <w:strike/>
+          <w:lang w:val="en-US"/>
+        </w:rPr>
+        <w:t>dari</w:t>
+      </w:r>
+      <w:proofErr w:type="spellEnd"/>
+      <w:r>
+        <w:rPr>
+          <w:strike/>
+          <w:lang w:val="en-US"/>
+        </w:rPr>
+        <w:t xml:space="preserve"> </w:t>
+      </w:r>
+      <w:proofErr w:type="spellStart"/>
+      <w:r>
+        <w:rPr>
+          <w:strike/>
+          <w:lang w:val="en-US"/>
+        </w:rPr>
+        <w:t>kasir</w:t>
+      </w:r>
+      <w:proofErr w:type="spellEnd"/>
+      <w:r>
+        <w:rPr>
+          <w:strike/>
+          <w:lang w:val="en-US"/>
+        </w:rPr>
+        <w:t xml:space="preserve"> di IDCARD</w:t>
+      </w:r>
     </w:p>
     <w:p>
       <w:pPr>
@@ -2733,12 +2605,14 @@
           <w:numId w:val="1"/>
         </w:numPr>
         <w:rPr>
-          <w:lang w:val="en-US"/>
-        </w:rPr>
-      </w:pPr>
-      <w:proofErr w:type="spellStart"/>
-      <w:r>
-        <w:rPr>
+          <w:strike/>
+          <w:lang w:val="en-US"/>
+        </w:rPr>
+      </w:pPr>
+      <w:proofErr w:type="spellStart"/>
+      <w:r>
+        <w:rPr>
+          <w:strike/>
           <w:lang w:val="en-US"/>
         </w:rPr>
         <w:t>Perjalanan</w:t>
@@ -2746,6 +2620,7 @@
       <w:proofErr w:type="spellEnd"/>
       <w:r>
         <w:rPr>
+          <w:strike/>
           <w:lang w:val="en-US"/>
         </w:rPr>
         <w:t xml:space="preserve"> Dinas </w:t>
@@ -2753,23 +2628,154 @@
       <w:proofErr w:type="spellStart"/>
       <w:r>
         <w:rPr>
-          <w:lang w:val="en-US"/>
-        </w:rPr>
-        <w:t>dapat</w:t>
-      </w:r>
-      <w:proofErr w:type="spellEnd"/>
-      <w:r>
-        <w:rPr>
-          <w:lang w:val="en-US"/>
-        </w:rPr>
-        <w:t xml:space="preserve"> di </w:t>
-      </w:r>
-      <w:proofErr w:type="spellStart"/>
-      <w:r>
-        <w:rPr>
-          <w:lang w:val="en-US"/>
-        </w:rPr>
-        <w:t>cetak</w:t>
+          <w:strike/>
+          <w:lang w:val="en-US"/>
+        </w:rPr>
+        <w:t>kurang</w:t>
+      </w:r>
+      <w:proofErr w:type="spellEnd"/>
+      <w:r>
+        <w:rPr>
+          <w:strike/>
+          <w:lang w:val="en-US"/>
+        </w:rPr>
+        <w:t xml:space="preserve"> </w:t>
+      </w:r>
+      <w:proofErr w:type="spellStart"/>
+      <w:proofErr w:type="gramStart"/>
+      <w:r>
+        <w:rPr>
+          <w:strike/>
+          <w:lang w:val="en-US"/>
+        </w:rPr>
+        <w:t>isian</w:t>
+      </w:r>
+      <w:proofErr w:type="spellEnd"/>
+      <w:r>
+        <w:rPr>
+          <w:strike/>
+          <w:lang w:val="en-US"/>
+        </w:rPr>
+        <w:t xml:space="preserve"> :</w:t>
+      </w:r>
+      <w:proofErr w:type="gramEnd"/>
+      <w:r>
+        <w:rPr>
+          <w:strike/>
+          <w:lang w:val="en-US"/>
+        </w:rPr>
+        <w:t xml:space="preserve"> </w:t>
+      </w:r>
+      <w:proofErr w:type="spellStart"/>
+      <w:r>
+        <w:rPr>
+          <w:strike/>
+          <w:lang w:val="en-US"/>
+        </w:rPr>
+        <w:t>kendaraan</w:t>
+      </w:r>
+      <w:proofErr w:type="spellEnd"/>
+      <w:r>
+        <w:rPr>
+          <w:strike/>
+          <w:lang w:val="en-US"/>
+        </w:rPr>
+        <w:t xml:space="preserve"> </w:t>
+      </w:r>
+      <w:proofErr w:type="spellStart"/>
+      <w:r>
+        <w:rPr>
+          <w:strike/>
+          <w:lang w:val="en-US"/>
+        </w:rPr>
+        <w:t>yg</w:t>
+      </w:r>
+      <w:proofErr w:type="spellEnd"/>
+      <w:r>
+        <w:rPr>
+          <w:strike/>
+          <w:lang w:val="en-US"/>
+        </w:rPr>
+        <w:t xml:space="preserve"> </w:t>
+      </w:r>
+      <w:proofErr w:type="spellStart"/>
+      <w:r>
+        <w:rPr>
+          <w:strike/>
+          <w:lang w:val="en-US"/>
+        </w:rPr>
+        <w:t>digunakan</w:t>
+      </w:r>
+      <w:proofErr w:type="spellEnd"/>
+      <w:r>
+        <w:rPr>
+          <w:strike/>
+          <w:lang w:val="en-US"/>
+        </w:rPr>
+        <w:t xml:space="preserve">, lama </w:t>
+      </w:r>
+      <w:proofErr w:type="spellStart"/>
+      <w:r>
+        <w:rPr>
+          <w:strike/>
+          <w:lang w:val="en-US"/>
+        </w:rPr>
+        <w:t>tugas</w:t>
+      </w:r>
+      <w:proofErr w:type="spellEnd"/>
+      <w:r>
+        <w:rPr>
+          <w:strike/>
+          <w:lang w:val="en-US"/>
+        </w:rPr>
+        <w:t xml:space="preserve"> </w:t>
+      </w:r>
+      <w:r>
+        <w:rPr>
+          <w:strike/>
+          <w:lang w:val="en-US"/>
+        </w:rPr>
+        <w:t xml:space="preserve">(&lt;4jam / &gt;4jam), </w:t>
+      </w:r>
+      <w:proofErr w:type="spellStart"/>
+      <w:r>
+        <w:rPr>
+          <w:strike/>
+          <w:lang w:val="en-US"/>
+        </w:rPr>
+        <w:t>keterangan</w:t>
+      </w:r>
+      <w:proofErr w:type="spellEnd"/>
+      <w:r>
+        <w:rPr>
+          <w:strike/>
+          <w:lang w:val="en-US"/>
+        </w:rPr>
+        <w:t>/</w:t>
+      </w:r>
+      <w:proofErr w:type="spellStart"/>
+      <w:r>
+        <w:rPr>
+          <w:strike/>
+          <w:lang w:val="en-US"/>
+        </w:rPr>
+        <w:t>deskripsi</w:t>
+      </w:r>
+      <w:proofErr w:type="spellEnd"/>
+      <w:r>
+        <w:rPr>
+          <w:strike/>
+          <w:lang w:val="en-US"/>
+        </w:rPr>
+        <w:t xml:space="preserve"> </w:t>
+      </w:r>
+      <w:proofErr w:type="spellStart"/>
+      <w:r>
+        <w:rPr>
+          <w:strike/>
+          <w:lang w:val="en-US"/>
+        </w:rPr>
+        <w:t>perjalanan</w:t>
       </w:r>
       <w:proofErr w:type="spellEnd"/>
     </w:p>
@@ -2781,218 +2787,50 @@
           <w:numId w:val="1"/>
         </w:numPr>
         <w:rPr>
-          <w:lang w:val="en-US"/>
-        </w:rPr>
-      </w:pPr>
-      <w:r>
-        <w:rPr>
+          <w:strike/>
+          <w:lang w:val="en-US"/>
+        </w:rPr>
+      </w:pPr>
+      <w:proofErr w:type="spellStart"/>
+      <w:r>
+        <w:rPr>
+          <w:strike/>
           <w:lang w:val="en-US"/>
         </w:rPr>
         <w:lastRenderedPageBreak/>
-        <w:t xml:space="preserve">Surat </w:t>
-      </w:r>
-      <w:proofErr w:type="spellStart"/>
-      <w:r>
-        <w:rPr>
-          <w:lang w:val="en-US"/>
-        </w:rPr>
-        <w:t>keterangan</w:t>
-      </w:r>
-      <w:proofErr w:type="spellEnd"/>
-      <w:r>
-        <w:rPr>
-          <w:lang w:val="en-US"/>
-        </w:rPr>
-        <w:t xml:space="preserve"> (input </w:t>
-      </w:r>
-      <w:proofErr w:type="spellStart"/>
-      <w:r>
-        <w:rPr>
-          <w:lang w:val="en-US"/>
-        </w:rPr>
-        <w:t>profesi</w:t>
-      </w:r>
-      <w:proofErr w:type="spellEnd"/>
-      <w:r>
-        <w:rPr>
-          <w:lang w:val="en-US"/>
-        </w:rPr>
-        <w:t xml:space="preserve"> </w:t>
-      </w:r>
-      <w:proofErr w:type="spellStart"/>
-      <w:r>
-        <w:rPr>
-          <w:lang w:val="en-US"/>
-        </w:rPr>
-        <w:t>sebagai</w:t>
-      </w:r>
-      <w:proofErr w:type="spellEnd"/>
-      <w:r>
-        <w:rPr>
-          <w:lang w:val="en-US"/>
-        </w:rPr>
-        <w:t xml:space="preserve"> …) </w:t>
-      </w:r>
-      <w:proofErr w:type="spellStart"/>
-      <w:r>
-        <w:rPr>
-          <w:lang w:val="en-US"/>
-        </w:rPr>
-        <w:t>diambil</w:t>
-      </w:r>
-      <w:proofErr w:type="spellEnd"/>
-      <w:r>
-        <w:rPr>
-          <w:lang w:val="en-US"/>
-        </w:rPr>
-        <w:t xml:space="preserve"> </w:t>
-      </w:r>
-      <w:proofErr w:type="spellStart"/>
-      <w:r>
-        <w:rPr>
-          <w:lang w:val="en-US"/>
-        </w:rPr>
-        <w:t>dari</w:t>
-      </w:r>
-      <w:proofErr w:type="spellEnd"/>
-      <w:r>
-        <w:rPr>
-          <w:lang w:val="en-US"/>
-        </w:rPr>
-        <w:t xml:space="preserve"> input </w:t>
-      </w:r>
-      <w:proofErr w:type="spellStart"/>
-      <w:r>
-        <w:rPr>
-          <w:lang w:val="en-US"/>
-        </w:rPr>
-        <w:t>profesi</w:t>
-      </w:r>
-      <w:proofErr w:type="spellEnd"/>
-      <w:r>
-        <w:rPr>
-          <w:lang w:val="en-US"/>
-        </w:rPr>
-        <w:t xml:space="preserve"> di </w:t>
-      </w:r>
-      <w:proofErr w:type="spellStart"/>
-      <w:r>
-        <w:rPr>
-          <w:lang w:val="en-US"/>
-        </w:rPr>
-        <w:t>profil</w:t>
-      </w:r>
-      <w:proofErr w:type="spellEnd"/>
-      <w:r>
-        <w:rPr>
-          <w:lang w:val="en-US"/>
-        </w:rPr>
-        <w:t xml:space="preserve"> </w:t>
-      </w:r>
-      <w:proofErr w:type="spellStart"/>
-      <w:r>
-        <w:rPr>
-          <w:lang w:val="en-US"/>
-        </w:rPr>
-        <w:t>kepegawaian</w:t>
-      </w:r>
-      <w:proofErr w:type="spellEnd"/>
-      <w:r>
-        <w:rPr>
-          <w:lang w:val="en-US"/>
-        </w:rPr>
-        <w:t xml:space="preserve"> (submenu </w:t>
-      </w:r>
-      <w:proofErr w:type="spellStart"/>
-      <w:r>
-        <w:rPr>
-          <w:lang w:val="en-US"/>
-        </w:rPr>
-        <w:t>kepegawaian</w:t>
-      </w:r>
-      <w:proofErr w:type="spellEnd"/>
-      <w:r>
-        <w:rPr>
-          <w:lang w:val="en-US"/>
-        </w:rPr>
-        <w:t xml:space="preserve"> di </w:t>
-      </w:r>
-      <w:proofErr w:type="spellStart"/>
-      <w:r>
-        <w:rPr>
-          <w:lang w:val="en-US"/>
-        </w:rPr>
-        <w:t>bawah</w:t>
-      </w:r>
-      <w:proofErr w:type="spellEnd"/>
-      <w:r>
-        <w:rPr>
-          <w:lang w:val="en-US"/>
-        </w:rPr>
-        <w:t xml:space="preserve"> </w:t>
-      </w:r>
-      <w:proofErr w:type="spellStart"/>
-      <w:r>
-        <w:rPr>
-          <w:lang w:val="en-US"/>
-        </w:rPr>
-        <w:t>pilihan</w:t>
-      </w:r>
-      <w:proofErr w:type="spellEnd"/>
-      <w:r>
-        <w:rPr>
-          <w:lang w:val="en-US"/>
-        </w:rPr>
-        <w:t xml:space="preserve"> </w:t>
-      </w:r>
-      <w:proofErr w:type="spellStart"/>
-      <w:r>
-        <w:rPr>
-          <w:lang w:val="en-US"/>
-        </w:rPr>
-        <w:t>nakesla</w:t>
-      </w:r>
-      <w:proofErr w:type="spellEnd"/>
-      <w:r>
-        <w:rPr>
-          <w:lang w:val="en-US"/>
-        </w:rPr>
-        <w:t xml:space="preserve">) </w:t>
-      </w:r>
-      <w:proofErr w:type="spellStart"/>
-      <w:r>
-        <w:rPr>
-          <w:lang w:val="en-US"/>
-        </w:rPr>
-        <w:t>tambah</w:t>
-      </w:r>
-      <w:proofErr w:type="spellEnd"/>
-      <w:r>
-        <w:rPr>
-          <w:lang w:val="en-US"/>
-        </w:rPr>
-        <w:t xml:space="preserve"> </w:t>
-      </w:r>
-      <w:proofErr w:type="spellStart"/>
-      <w:r>
-        <w:rPr>
-          <w:lang w:val="en-US"/>
-        </w:rPr>
-        <w:t>kolom</w:t>
-      </w:r>
-      <w:proofErr w:type="spellEnd"/>
-      <w:r>
-        <w:rPr>
-          <w:lang w:val="en-US"/>
-        </w:rPr>
-        <w:t xml:space="preserve"> </w:t>
-      </w:r>
-      <w:proofErr w:type="spellStart"/>
-      <w:r>
-        <w:rPr>
-          <w:lang w:val="en-US"/>
-        </w:rPr>
-        <w:t>baru</w:t>
+        <w:t>Perjalanan</w:t>
+      </w:r>
+      <w:proofErr w:type="spellEnd"/>
+      <w:r>
+        <w:rPr>
+          <w:strike/>
+          <w:lang w:val="en-US"/>
+        </w:rPr>
+        <w:t xml:space="preserve"> Dinas </w:t>
+      </w:r>
+      <w:proofErr w:type="spellStart"/>
+      <w:r>
+        <w:rPr>
+          <w:strike/>
+          <w:lang w:val="en-US"/>
+        </w:rPr>
+        <w:t>dihapus</w:t>
+      </w:r>
+      <w:proofErr w:type="spellEnd"/>
+      <w:r>
+        <w:rPr>
+          <w:strike/>
+          <w:lang w:val="en-US"/>
+        </w:rPr>
+        <w:t xml:space="preserve"> upload </w:t>
+      </w:r>
+      <w:proofErr w:type="spellStart"/>
+      <w:r>
+        <w:rPr>
+          <w:strike/>
+          <w:lang w:val="en-US"/>
+        </w:rPr>
+        <w:t>filenya</w:t>
       </w:r>
       <w:proofErr w:type="spellEnd"/>
     </w:p>
@@ -3004,81 +2842,43 @@
           <w:numId w:val="1"/>
         </w:numPr>
         <w:rPr>
-          <w:color w:val="FF0000"/>
-          <w:lang w:val="en-US"/>
-        </w:rPr>
-      </w:pPr>
-      <w:proofErr w:type="spellStart"/>
-      <w:r>
-        <w:rPr>
-          <w:color w:val="FF0000"/>
-          <w:lang w:val="en-US"/>
-        </w:rPr>
-        <w:t>Pilihan</w:t>
-      </w:r>
-      <w:proofErr w:type="spellEnd"/>
-      <w:r>
-        <w:rPr>
-          <w:color w:val="FF0000"/>
-          <w:lang w:val="en-US"/>
-        </w:rPr>
-        <w:t xml:space="preserve"> LAIN-LAIN </w:t>
-      </w:r>
-      <w:proofErr w:type="spellStart"/>
-      <w:r>
-        <w:rPr>
-          <w:color w:val="FF0000"/>
-          <w:lang w:val="en-US"/>
-        </w:rPr>
-        <w:t>dihapus</w:t>
-      </w:r>
-      <w:proofErr w:type="spellEnd"/>
-      <w:r>
-        <w:rPr>
-          <w:color w:val="FF0000"/>
-          <w:lang w:val="en-US"/>
-        </w:rPr>
-        <w:t xml:space="preserve">, </w:t>
-      </w:r>
-      <w:proofErr w:type="spellStart"/>
-      <w:r>
-        <w:rPr>
-          <w:color w:val="FF0000"/>
-          <w:lang w:val="en-US"/>
-        </w:rPr>
-        <w:t>dibuat</w:t>
-      </w:r>
-      <w:proofErr w:type="spellEnd"/>
-      <w:r>
-        <w:rPr>
-          <w:color w:val="FF0000"/>
-          <w:lang w:val="en-US"/>
-        </w:rPr>
-        <w:t xml:space="preserve"> </w:t>
-      </w:r>
-      <w:proofErr w:type="spellStart"/>
-      <w:r>
-        <w:rPr>
-          <w:color w:val="FF0000"/>
-          <w:lang w:val="en-US"/>
-        </w:rPr>
-        <w:t>bisa</w:t>
-      </w:r>
-      <w:proofErr w:type="spellEnd"/>
-      <w:r>
-        <w:rPr>
-          <w:color w:val="FF0000"/>
-          <w:lang w:val="en-US"/>
-        </w:rPr>
-        <w:t xml:space="preserve"> custom </w:t>
-      </w:r>
-      <w:proofErr w:type="spellStart"/>
-      <w:r>
-        <w:rPr>
-          <w:color w:val="FF0000"/>
-          <w:lang w:val="en-US"/>
-        </w:rPr>
-        <w:t>sendiri</w:t>
+          <w:lang w:val="en-US"/>
+        </w:rPr>
+      </w:pPr>
+      <w:proofErr w:type="spellStart"/>
+      <w:r>
+        <w:rPr>
+          <w:lang w:val="en-US"/>
+        </w:rPr>
+        <w:t>Perjalanan</w:t>
+      </w:r>
+      <w:proofErr w:type="spellEnd"/>
+      <w:r>
+        <w:rPr>
+          <w:lang w:val="en-US"/>
+        </w:rPr>
+        <w:t xml:space="preserve"> Dinas </w:t>
+      </w:r>
+      <w:proofErr w:type="spellStart"/>
+      <w:r>
+        <w:rPr>
+          <w:lang w:val="en-US"/>
+        </w:rPr>
+        <w:t>dapat</w:t>
+      </w:r>
+      <w:proofErr w:type="spellEnd"/>
+      <w:r>
+        <w:rPr>
+          <w:lang w:val="en-US"/>
+        </w:rPr>
+        <w:t xml:space="preserve"> di </w:t>
+      </w:r>
+      <w:proofErr w:type="spellStart"/>
+      <w:r>
+        <w:rPr>
+          <w:lang w:val="en-US"/>
+        </w:rPr>
+        <w:t>cetak</w:t>
       </w:r>
       <w:proofErr w:type="spellEnd"/>
     </w:p>
@@ -3093,89 +2893,11 @@
           <w:lang w:val="en-US"/>
         </w:rPr>
       </w:pPr>
-      <w:proofErr w:type="spellStart"/>
-      <w:r>
-        <w:rPr>
-          <w:lang w:val="en-US"/>
-        </w:rPr>
-        <w:t>Kepegawaian</w:t>
-      </w:r>
-      <w:proofErr w:type="spellEnd"/>
-      <w:r>
-        <w:rPr>
-          <w:lang w:val="en-US"/>
-        </w:rPr>
-        <w:t xml:space="preserve"> </w:t>
-      </w:r>
-      <w:proofErr w:type="spellStart"/>
-      <w:r>
-        <w:rPr>
-          <w:lang w:val="en-US"/>
-        </w:rPr>
-        <w:t>dapat</w:t>
-      </w:r>
-      <w:proofErr w:type="spellEnd"/>
-      <w:r>
-        <w:rPr>
-          <w:lang w:val="en-US"/>
-        </w:rPr>
-        <w:t xml:space="preserve"> </w:t>
-      </w:r>
-      <w:proofErr w:type="spellStart"/>
-      <w:r>
-        <w:rPr>
-          <w:lang w:val="en-US"/>
-        </w:rPr>
-        <w:t>mendownload</w:t>
-      </w:r>
-      <w:proofErr w:type="spellEnd"/>
-      <w:r>
-        <w:rPr>
-          <w:lang w:val="en-US"/>
-        </w:rPr>
-        <w:t xml:space="preserve"> </w:t>
-      </w:r>
-      <w:proofErr w:type="spellStart"/>
-      <w:r>
-        <w:rPr>
-          <w:lang w:val="en-US"/>
-        </w:rPr>
-        <w:t>semua</w:t>
-      </w:r>
-      <w:proofErr w:type="spellEnd"/>
-      <w:r>
-        <w:rPr>
-          <w:lang w:val="en-US"/>
-        </w:rPr>
-        <w:t xml:space="preserve"> file </w:t>
-      </w:r>
-      <w:proofErr w:type="spellStart"/>
-      <w:r>
-        <w:rPr>
-          <w:lang w:val="en-US"/>
-        </w:rPr>
-        <w:t>mentah</w:t>
-      </w:r>
-      <w:proofErr w:type="spellEnd"/>
-      <w:r>
-        <w:rPr>
-          <w:lang w:val="en-US"/>
-        </w:rPr>
-        <w:t xml:space="preserve"> </w:t>
-      </w:r>
-      <w:proofErr w:type="spellStart"/>
-      <w:r>
-        <w:rPr>
-          <w:lang w:val="en-US"/>
-        </w:rPr>
-        <w:t>surat</w:t>
-      </w:r>
-      <w:proofErr w:type="spellEnd"/>
-      <w:r>
-        <w:rPr>
-          <w:lang w:val="en-US"/>
-        </w:rPr>
-        <w:t xml:space="preserve"> </w:t>
+      <w:r>
+        <w:rPr>
+          <w:lang w:val="en-US"/>
+        </w:rPr>
+        <w:t xml:space="preserve">Surat </w:t>
       </w:r>
       <w:proofErr w:type="spellStart"/>
       <w:r>
@@ -3189,120 +2911,198 @@
         <w:rPr>
           <w:lang w:val="en-US"/>
         </w:rPr>
-        <w:t xml:space="preserve"> dan upload file scan </w:t>
-      </w:r>
-      <w:proofErr w:type="spellStart"/>
-      <w:r>
-        <w:rPr>
-          <w:lang w:val="en-US"/>
-        </w:rPr>
-        <w:t>jadi</w:t>
-      </w:r>
-      <w:proofErr w:type="spellEnd"/>
-      <w:r>
-        <w:rPr>
-          <w:lang w:val="en-US"/>
-        </w:rPr>
-        <w:t xml:space="preserve"> </w:t>
-      </w:r>
-      <w:proofErr w:type="spellStart"/>
-      <w:r>
-        <w:rPr>
-          <w:lang w:val="en-US"/>
-        </w:rPr>
-        <w:t>suratnya</w:t>
-      </w:r>
-      <w:proofErr w:type="spellEnd"/>
-      <w:r>
-        <w:rPr>
-          <w:lang w:val="en-US"/>
-        </w:rPr>
-        <w:t xml:space="preserve">. </w:t>
-      </w:r>
-      <w:proofErr w:type="spellStart"/>
-      <w:r>
-        <w:rPr>
-          <w:lang w:val="en-US"/>
-        </w:rPr>
-        <w:t>Pegawai</w:t>
-      </w:r>
-      <w:proofErr w:type="spellEnd"/>
-      <w:r>
-        <w:rPr>
-          <w:lang w:val="en-US"/>
-        </w:rPr>
-        <w:t xml:space="preserve"> </w:t>
-      </w:r>
-      <w:proofErr w:type="spellStart"/>
-      <w:r>
-        <w:rPr>
-          <w:lang w:val="en-US"/>
-        </w:rPr>
-        <w:t>yg</w:t>
-      </w:r>
-      <w:proofErr w:type="spellEnd"/>
-      <w:r>
-        <w:rPr>
-          <w:lang w:val="en-US"/>
-        </w:rPr>
-        <w:t xml:space="preserve"> </w:t>
-      </w:r>
-      <w:proofErr w:type="spellStart"/>
-      <w:r>
-        <w:rPr>
-          <w:lang w:val="en-US"/>
-        </w:rPr>
-        <w:t>bersangkutan</w:t>
-      </w:r>
-      <w:proofErr w:type="spellEnd"/>
-      <w:r>
-        <w:rPr>
-          <w:lang w:val="en-US"/>
-        </w:rPr>
-        <w:t xml:space="preserve"> </w:t>
-      </w:r>
-      <w:proofErr w:type="spellStart"/>
-      <w:r>
-        <w:rPr>
-          <w:lang w:val="en-US"/>
-        </w:rPr>
-        <w:t>hanya</w:t>
-      </w:r>
-      <w:proofErr w:type="spellEnd"/>
-      <w:r>
-        <w:rPr>
-          <w:lang w:val="en-US"/>
-        </w:rPr>
-        <w:t xml:space="preserve"> </w:t>
-      </w:r>
-      <w:proofErr w:type="spellStart"/>
-      <w:r>
-        <w:rPr>
-          <w:lang w:val="en-US"/>
-        </w:rPr>
-        <w:t>dapat</w:t>
-      </w:r>
-      <w:proofErr w:type="spellEnd"/>
-      <w:r>
-        <w:rPr>
-          <w:lang w:val="en-US"/>
-        </w:rPr>
-        <w:t xml:space="preserve"> </w:t>
-      </w:r>
-      <w:proofErr w:type="spellStart"/>
-      <w:r>
-        <w:rPr>
-          <w:lang w:val="en-US"/>
-        </w:rPr>
-        <w:t>mendownload</w:t>
-      </w:r>
-      <w:proofErr w:type="spellEnd"/>
-      <w:r>
-        <w:rPr>
-          <w:lang w:val="en-US"/>
-        </w:rPr>
-        <w:t xml:space="preserve"> file scan</w:t>
-      </w:r>
+        <w:t xml:space="preserve"> (input </w:t>
+      </w:r>
+      <w:proofErr w:type="spellStart"/>
+      <w:r>
+        <w:rPr>
+          <w:lang w:val="en-US"/>
+        </w:rPr>
+        <w:t>profesi</w:t>
+      </w:r>
+      <w:proofErr w:type="spellEnd"/>
+      <w:r>
+        <w:rPr>
+          <w:lang w:val="en-US"/>
+        </w:rPr>
+        <w:t xml:space="preserve"> </w:t>
+      </w:r>
+      <w:proofErr w:type="spellStart"/>
+      <w:r>
+        <w:rPr>
+          <w:lang w:val="en-US"/>
+        </w:rPr>
+        <w:t>sebagai</w:t>
+      </w:r>
+      <w:proofErr w:type="spellEnd"/>
+      <w:r>
+        <w:rPr>
+          <w:lang w:val="en-US"/>
+        </w:rPr>
+        <w:t xml:space="preserve"> …) </w:t>
+      </w:r>
+      <w:proofErr w:type="spellStart"/>
+      <w:r>
+        <w:rPr>
+          <w:lang w:val="en-US"/>
+        </w:rPr>
+        <w:t>diambil</w:t>
+      </w:r>
+      <w:proofErr w:type="spellEnd"/>
+      <w:r>
+        <w:rPr>
+          <w:lang w:val="en-US"/>
+        </w:rPr>
+        <w:t xml:space="preserve"> </w:t>
+      </w:r>
+      <w:proofErr w:type="spellStart"/>
+      <w:r>
+        <w:rPr>
+          <w:lang w:val="en-US"/>
+        </w:rPr>
+        <w:t>dari</w:t>
+      </w:r>
+      <w:proofErr w:type="spellEnd"/>
+      <w:r>
+        <w:rPr>
+          <w:lang w:val="en-US"/>
+        </w:rPr>
+        <w:t xml:space="preserve"> input </w:t>
+      </w:r>
+      <w:proofErr w:type="spellStart"/>
+      <w:r>
+        <w:rPr>
+          <w:lang w:val="en-US"/>
+        </w:rPr>
+        <w:t>profesi</w:t>
+      </w:r>
+      <w:proofErr w:type="spellEnd"/>
+      <w:r>
+        <w:rPr>
+          <w:lang w:val="en-US"/>
+        </w:rPr>
+        <w:t xml:space="preserve"> di </w:t>
+      </w:r>
+      <w:proofErr w:type="spellStart"/>
+      <w:r>
+        <w:rPr>
+          <w:lang w:val="en-US"/>
+        </w:rPr>
+        <w:t>profil</w:t>
+      </w:r>
+      <w:proofErr w:type="spellEnd"/>
+      <w:r>
+        <w:rPr>
+          <w:lang w:val="en-US"/>
+        </w:rPr>
+        <w:t xml:space="preserve"> </w:t>
+      </w:r>
+      <w:proofErr w:type="spellStart"/>
+      <w:r>
+        <w:rPr>
+          <w:lang w:val="en-US"/>
+        </w:rPr>
+        <w:t>kepegawaian</w:t>
+      </w:r>
+      <w:proofErr w:type="spellEnd"/>
+      <w:r>
+        <w:rPr>
+          <w:lang w:val="en-US"/>
+        </w:rPr>
+        <w:t xml:space="preserve"> (submenu </w:t>
+      </w:r>
+      <w:proofErr w:type="spellStart"/>
+      <w:r>
+        <w:rPr>
+          <w:lang w:val="en-US"/>
+        </w:rPr>
+        <w:t>kepegawaian</w:t>
+      </w:r>
+      <w:proofErr w:type="spellEnd"/>
+      <w:r>
+        <w:rPr>
+          <w:lang w:val="en-US"/>
+        </w:rPr>
+        <w:t xml:space="preserve"> di </w:t>
+      </w:r>
+      <w:proofErr w:type="spellStart"/>
+      <w:r>
+        <w:rPr>
+          <w:lang w:val="en-US"/>
+        </w:rPr>
+        <w:t>bawah</w:t>
+      </w:r>
+      <w:proofErr w:type="spellEnd"/>
+      <w:r>
+        <w:rPr>
+          <w:lang w:val="en-US"/>
+        </w:rPr>
+        <w:t xml:space="preserve"> </w:t>
+      </w:r>
+      <w:proofErr w:type="spellStart"/>
+      <w:r>
+        <w:rPr>
+          <w:lang w:val="en-US"/>
+        </w:rPr>
+        <w:t>pilihan</w:t>
+      </w:r>
+      <w:proofErr w:type="spellEnd"/>
+      <w:r>
+        <w:rPr>
+          <w:lang w:val="en-US"/>
+        </w:rPr>
+        <w:t xml:space="preserve"> </w:t>
+      </w:r>
+      <w:proofErr w:type="spellStart"/>
+      <w:r>
+        <w:rPr>
+          <w:lang w:val="en-US"/>
+        </w:rPr>
+        <w:t>nakesla</w:t>
+      </w:r>
+      <w:proofErr w:type="spellEnd"/>
+      <w:r>
+        <w:rPr>
+          <w:lang w:val="en-US"/>
+        </w:rPr>
+        <w:t xml:space="preserve">) </w:t>
+      </w:r>
+      <w:proofErr w:type="spellStart"/>
+      <w:r>
+        <w:rPr>
+          <w:lang w:val="en-US"/>
+        </w:rPr>
+        <w:t>tambah</w:t>
+      </w:r>
+      <w:proofErr w:type="spellEnd"/>
+      <w:r>
+        <w:rPr>
+          <w:lang w:val="en-US"/>
+        </w:rPr>
+        <w:t xml:space="preserve"> </w:t>
+      </w:r>
+      <w:proofErr w:type="spellStart"/>
+      <w:r>
+        <w:rPr>
+          <w:lang w:val="en-US"/>
+        </w:rPr>
+        <w:t>kolom</w:t>
+      </w:r>
+      <w:proofErr w:type="spellEnd"/>
+      <w:r>
+        <w:rPr>
+          <w:lang w:val="en-US"/>
+        </w:rPr>
+        <w:t xml:space="preserve"> </w:t>
+      </w:r>
+      <w:proofErr w:type="spellStart"/>
+      <w:r>
+        <w:rPr>
+          <w:lang w:val="en-US"/>
+        </w:rPr>
+        <w:t>baru</w:t>
+      </w:r>
+      <w:proofErr w:type="spellEnd"/>
     </w:p>
     <w:p>
       <w:pPr>
@@ -3312,155 +3112,81 @@
           <w:numId w:val="1"/>
         </w:numPr>
         <w:rPr>
-          <w:lang w:val="en-US"/>
-        </w:rPr>
-      </w:pPr>
-      <w:proofErr w:type="spellStart"/>
-      <w:r>
-        <w:rPr>
-          <w:lang w:val="en-US"/>
-        </w:rPr>
-        <w:t>Penomoran</w:t>
-      </w:r>
-      <w:proofErr w:type="spellEnd"/>
-      <w:r>
-        <w:rPr>
-          <w:lang w:val="en-US"/>
-        </w:rPr>
-        <w:t xml:space="preserve"> </w:t>
-      </w:r>
-      <w:proofErr w:type="spellStart"/>
-      <w:r>
-        <w:rPr>
-          <w:lang w:val="en-US"/>
-        </w:rPr>
-        <w:t>surat</w:t>
-      </w:r>
-      <w:proofErr w:type="spellEnd"/>
-      <w:r>
-        <w:rPr>
-          <w:lang w:val="en-US"/>
-        </w:rPr>
-        <w:t xml:space="preserve"> </w:t>
-      </w:r>
-      <w:proofErr w:type="spellStart"/>
-      <w:r>
-        <w:rPr>
-          <w:lang w:val="en-US"/>
-        </w:rPr>
-        <w:t>keterangan</w:t>
-      </w:r>
-      <w:proofErr w:type="spellEnd"/>
-      <w:r>
-        <w:rPr>
-          <w:lang w:val="en-US"/>
-        </w:rPr>
-        <w:t xml:space="preserve"> </w:t>
-      </w:r>
-      <w:proofErr w:type="spellStart"/>
-      <w:r>
-        <w:rPr>
-          <w:lang w:val="en-US"/>
-        </w:rPr>
-        <w:t>dikosongi</w:t>
-      </w:r>
-      <w:proofErr w:type="spellEnd"/>
-      <w:r>
-        <w:rPr>
-          <w:lang w:val="en-US"/>
-        </w:rPr>
-        <w:t xml:space="preserve"> </w:t>
-      </w:r>
-      <w:proofErr w:type="spellStart"/>
-      <w:r>
-        <w:rPr>
-          <w:lang w:val="en-US"/>
-        </w:rPr>
-        <w:t>saja</w:t>
-      </w:r>
-      <w:proofErr w:type="spellEnd"/>
-      <w:r>
-        <w:rPr>
-          <w:lang w:val="en-US"/>
-        </w:rPr>
-        <w:t xml:space="preserve">. </w:t>
-      </w:r>
-      <w:proofErr w:type="spellStart"/>
-      <w:r>
-        <w:rPr>
-          <w:lang w:val="en-US"/>
-        </w:rPr>
-        <w:t>Tgl</w:t>
-      </w:r>
-      <w:proofErr w:type="spellEnd"/>
-      <w:r>
-        <w:rPr>
-          <w:lang w:val="en-US"/>
-        </w:rPr>
-        <w:t>/</w:t>
-      </w:r>
-      <w:proofErr w:type="spellStart"/>
-      <w:r>
-        <w:rPr>
-          <w:lang w:val="en-US"/>
-        </w:rPr>
-        <w:t>Tahun</w:t>
-      </w:r>
-      <w:proofErr w:type="spellEnd"/>
-      <w:r>
-        <w:rPr>
-          <w:lang w:val="en-US"/>
-        </w:rPr>
-        <w:t xml:space="preserve"> </w:t>
-      </w:r>
-      <w:proofErr w:type="spellStart"/>
-      <w:r>
-        <w:rPr>
-          <w:lang w:val="en-US"/>
-        </w:rPr>
-        <w:t>surat</w:t>
-      </w:r>
-      <w:proofErr w:type="spellEnd"/>
-      <w:r>
-        <w:rPr>
-          <w:lang w:val="en-US"/>
-        </w:rPr>
-        <w:t xml:space="preserve"> </w:t>
-      </w:r>
-      <w:proofErr w:type="spellStart"/>
-      <w:r>
-        <w:rPr>
-          <w:lang w:val="en-US"/>
-        </w:rPr>
-        <w:t>menyesuaikan</w:t>
-      </w:r>
-      <w:proofErr w:type="spellEnd"/>
-      <w:r>
-        <w:rPr>
-          <w:lang w:val="en-US"/>
-        </w:rPr>
-        <w:t xml:space="preserve"> </w:t>
-      </w:r>
-      <w:proofErr w:type="spellStart"/>
-      <w:r>
-        <w:rPr>
-          <w:lang w:val="en-US"/>
-        </w:rPr>
-        <w:t>tanggal</w:t>
-      </w:r>
-      <w:proofErr w:type="spellEnd"/>
-      <w:r>
-        <w:rPr>
-          <w:lang w:val="en-US"/>
-        </w:rPr>
-        <w:t xml:space="preserve"> input </w:t>
-      </w:r>
-      <w:proofErr w:type="spellStart"/>
-      <w:r>
-        <w:rPr>
-          <w:lang w:val="en-US"/>
-        </w:rPr>
-        <w:t>pegawai</w:t>
+          <w:color w:val="FF0000"/>
+          <w:lang w:val="en-US"/>
+        </w:rPr>
+      </w:pPr>
+      <w:proofErr w:type="spellStart"/>
+      <w:r>
+        <w:rPr>
+          <w:color w:val="FF0000"/>
+          <w:lang w:val="en-US"/>
+        </w:rPr>
+        <w:t>Pilihan</w:t>
+      </w:r>
+      <w:proofErr w:type="spellEnd"/>
+      <w:r>
+        <w:rPr>
+          <w:color w:val="FF0000"/>
+          <w:lang w:val="en-US"/>
+        </w:rPr>
+        <w:t xml:space="preserve"> LAIN-LAIN </w:t>
+      </w:r>
+      <w:proofErr w:type="spellStart"/>
+      <w:r>
+        <w:rPr>
+          <w:color w:val="FF0000"/>
+          <w:lang w:val="en-US"/>
+        </w:rPr>
+        <w:t>dihapus</w:t>
+      </w:r>
+      <w:proofErr w:type="spellEnd"/>
+      <w:r>
+        <w:rPr>
+          <w:color w:val="FF0000"/>
+          <w:lang w:val="en-US"/>
+        </w:rPr>
+        <w:t xml:space="preserve">, </w:t>
+      </w:r>
+      <w:proofErr w:type="spellStart"/>
+      <w:r>
+        <w:rPr>
+          <w:color w:val="FF0000"/>
+          <w:lang w:val="en-US"/>
+        </w:rPr>
+        <w:t>dibuat</w:t>
+      </w:r>
+      <w:proofErr w:type="spellEnd"/>
+      <w:r>
+        <w:rPr>
+          <w:color w:val="FF0000"/>
+          <w:lang w:val="en-US"/>
+        </w:rPr>
+        <w:t xml:space="preserve"> </w:t>
+      </w:r>
+      <w:proofErr w:type="spellStart"/>
+      <w:r>
+        <w:rPr>
+          <w:color w:val="FF0000"/>
+          <w:lang w:val="en-US"/>
+        </w:rPr>
+        <w:t>bisa</w:t>
+      </w:r>
+      <w:proofErr w:type="spellEnd"/>
+      <w:r>
+        <w:rPr>
+          <w:color w:val="FF0000"/>
+          <w:lang w:val="en-US"/>
+        </w:rPr>
+        <w:t xml:space="preserve"> custom </w:t>
+      </w:r>
+      <w:proofErr w:type="spellStart"/>
+      <w:r>
+        <w:rPr>
+          <w:color w:val="FF0000"/>
+          <w:lang w:val="en-US"/>
+        </w:rPr>
+        <w:t>sendiri</w:t>
       </w:r>
       <w:proofErr w:type="spellEnd"/>
     </w:p>
@@ -3480,6 +3206,388 @@
         <w:rPr>
           <w:lang w:val="en-US"/>
         </w:rPr>
+        <w:t>Kepegawaian</w:t>
+      </w:r>
+      <w:proofErr w:type="spellEnd"/>
+      <w:r>
+        <w:rPr>
+          <w:lang w:val="en-US"/>
+        </w:rPr>
+        <w:t xml:space="preserve"> </w:t>
+      </w:r>
+      <w:proofErr w:type="spellStart"/>
+      <w:r>
+        <w:rPr>
+          <w:lang w:val="en-US"/>
+        </w:rPr>
+        <w:t>dapat</w:t>
+      </w:r>
+      <w:proofErr w:type="spellEnd"/>
+      <w:r>
+        <w:rPr>
+          <w:lang w:val="en-US"/>
+        </w:rPr>
+        <w:t xml:space="preserve"> </w:t>
+      </w:r>
+      <w:proofErr w:type="spellStart"/>
+      <w:r>
+        <w:rPr>
+          <w:lang w:val="en-US"/>
+        </w:rPr>
+        <w:t>mendownload</w:t>
+      </w:r>
+      <w:proofErr w:type="spellEnd"/>
+      <w:r>
+        <w:rPr>
+          <w:lang w:val="en-US"/>
+        </w:rPr>
+        <w:t xml:space="preserve"> </w:t>
+      </w:r>
+      <w:proofErr w:type="spellStart"/>
+      <w:r>
+        <w:rPr>
+          <w:lang w:val="en-US"/>
+        </w:rPr>
+        <w:t>semua</w:t>
+      </w:r>
+      <w:proofErr w:type="spellEnd"/>
+      <w:r>
+        <w:rPr>
+          <w:lang w:val="en-US"/>
+        </w:rPr>
+        <w:t xml:space="preserve"> file </w:t>
+      </w:r>
+      <w:proofErr w:type="spellStart"/>
+      <w:r>
+        <w:rPr>
+          <w:lang w:val="en-US"/>
+        </w:rPr>
+        <w:t>mentah</w:t>
+      </w:r>
+      <w:proofErr w:type="spellEnd"/>
+      <w:r>
+        <w:rPr>
+          <w:lang w:val="en-US"/>
+        </w:rPr>
+        <w:t xml:space="preserve"> </w:t>
+      </w:r>
+      <w:proofErr w:type="spellStart"/>
+      <w:r>
+        <w:rPr>
+          <w:lang w:val="en-US"/>
+        </w:rPr>
+        <w:t>surat</w:t>
+      </w:r>
+      <w:proofErr w:type="spellEnd"/>
+      <w:r>
+        <w:rPr>
+          <w:lang w:val="en-US"/>
+        </w:rPr>
+        <w:t xml:space="preserve"> </w:t>
+      </w:r>
+      <w:proofErr w:type="spellStart"/>
+      <w:r>
+        <w:rPr>
+          <w:lang w:val="en-US"/>
+        </w:rPr>
+        <w:t>keterangan</w:t>
+      </w:r>
+      <w:proofErr w:type="spellEnd"/>
+      <w:r>
+        <w:rPr>
+          <w:lang w:val="en-US"/>
+        </w:rPr>
+        <w:t xml:space="preserve"> dan upload file scan </w:t>
+      </w:r>
+      <w:proofErr w:type="spellStart"/>
+      <w:r>
+        <w:rPr>
+          <w:lang w:val="en-US"/>
+        </w:rPr>
+        <w:t>jadi</w:t>
+      </w:r>
+      <w:proofErr w:type="spellEnd"/>
+      <w:r>
+        <w:rPr>
+          <w:lang w:val="en-US"/>
+        </w:rPr>
+        <w:t xml:space="preserve"> </w:t>
+      </w:r>
+      <w:proofErr w:type="spellStart"/>
+      <w:r>
+        <w:rPr>
+          <w:lang w:val="en-US"/>
+        </w:rPr>
+        <w:t>suratnya</w:t>
+      </w:r>
+      <w:proofErr w:type="spellEnd"/>
+      <w:r>
+        <w:rPr>
+          <w:lang w:val="en-US"/>
+        </w:rPr>
+        <w:t xml:space="preserve">. </w:t>
+      </w:r>
+      <w:proofErr w:type="spellStart"/>
+      <w:r>
+        <w:rPr>
+          <w:lang w:val="en-US"/>
+        </w:rPr>
+        <w:t>Pegawai</w:t>
+      </w:r>
+      <w:proofErr w:type="spellEnd"/>
+      <w:r>
+        <w:rPr>
+          <w:lang w:val="en-US"/>
+        </w:rPr>
+        <w:t xml:space="preserve"> </w:t>
+      </w:r>
+      <w:proofErr w:type="spellStart"/>
+      <w:r>
+        <w:rPr>
+          <w:lang w:val="en-US"/>
+        </w:rPr>
+        <w:t>yg</w:t>
+      </w:r>
+      <w:proofErr w:type="spellEnd"/>
+      <w:r>
+        <w:rPr>
+          <w:lang w:val="en-US"/>
+        </w:rPr>
+        <w:t xml:space="preserve"> </w:t>
+      </w:r>
+      <w:proofErr w:type="spellStart"/>
+      <w:r>
+        <w:rPr>
+          <w:lang w:val="en-US"/>
+        </w:rPr>
+        <w:t>bersangkutan</w:t>
+      </w:r>
+      <w:proofErr w:type="spellEnd"/>
+      <w:r>
+        <w:rPr>
+          <w:lang w:val="en-US"/>
+        </w:rPr>
+        <w:t xml:space="preserve"> </w:t>
+      </w:r>
+      <w:proofErr w:type="spellStart"/>
+      <w:r>
+        <w:rPr>
+          <w:lang w:val="en-US"/>
+        </w:rPr>
+        <w:t>hanya</w:t>
+      </w:r>
+      <w:proofErr w:type="spellEnd"/>
+      <w:r>
+        <w:rPr>
+          <w:lang w:val="en-US"/>
+        </w:rPr>
+        <w:t xml:space="preserve"> </w:t>
+      </w:r>
+      <w:proofErr w:type="spellStart"/>
+      <w:r>
+        <w:rPr>
+          <w:lang w:val="en-US"/>
+        </w:rPr>
+        <w:t>dapat</w:t>
+      </w:r>
+      <w:proofErr w:type="spellEnd"/>
+      <w:r>
+        <w:rPr>
+          <w:lang w:val="en-US"/>
+        </w:rPr>
+        <w:t xml:space="preserve"> </w:t>
+      </w:r>
+      <w:proofErr w:type="spellStart"/>
+      <w:r>
+        <w:rPr>
+          <w:lang w:val="en-US"/>
+        </w:rPr>
+        <w:t>mendownload</w:t>
+      </w:r>
+      <w:proofErr w:type="spellEnd"/>
+      <w:r>
+        <w:rPr>
+          <w:lang w:val="en-US"/>
+        </w:rPr>
+        <w:t xml:space="preserve"> file scan</w:t>
+      </w:r>
+    </w:p>
+    <w:p>
+      <w:pPr>
+        <w:pStyle w:val="ListParagraph"/>
+        <w:numPr>
+          <w:ilvl w:val="0"/>
+          <w:numId w:val="1"/>
+        </w:numPr>
+        <w:rPr>
+          <w:lang w:val="en-US"/>
+        </w:rPr>
+      </w:pPr>
+      <w:proofErr w:type="spellStart"/>
+      <w:r>
+        <w:rPr>
+          <w:lang w:val="en-US"/>
+        </w:rPr>
+        <w:t>Penomoran</w:t>
+      </w:r>
+      <w:proofErr w:type="spellEnd"/>
+      <w:r>
+        <w:rPr>
+          <w:lang w:val="en-US"/>
+        </w:rPr>
+        <w:t xml:space="preserve"> </w:t>
+      </w:r>
+      <w:proofErr w:type="spellStart"/>
+      <w:r>
+        <w:rPr>
+          <w:lang w:val="en-US"/>
+        </w:rPr>
+        <w:t>surat</w:t>
+      </w:r>
+      <w:proofErr w:type="spellEnd"/>
+      <w:r>
+        <w:rPr>
+          <w:lang w:val="en-US"/>
+        </w:rPr>
+        <w:t xml:space="preserve"> </w:t>
+      </w:r>
+      <w:proofErr w:type="spellStart"/>
+      <w:r>
+        <w:rPr>
+          <w:lang w:val="en-US"/>
+        </w:rPr>
+        <w:t>keterangan</w:t>
+      </w:r>
+      <w:proofErr w:type="spellEnd"/>
+      <w:r>
+        <w:rPr>
+          <w:lang w:val="en-US"/>
+        </w:rPr>
+        <w:t xml:space="preserve"> </w:t>
+      </w:r>
+      <w:proofErr w:type="spellStart"/>
+      <w:r>
+        <w:rPr>
+          <w:lang w:val="en-US"/>
+        </w:rPr>
+        <w:t>dikosongi</w:t>
+      </w:r>
+      <w:proofErr w:type="spellEnd"/>
+      <w:r>
+        <w:rPr>
+          <w:lang w:val="en-US"/>
+        </w:rPr>
+        <w:t xml:space="preserve"> </w:t>
+      </w:r>
+      <w:proofErr w:type="spellStart"/>
+      <w:r>
+        <w:rPr>
+          <w:lang w:val="en-US"/>
+        </w:rPr>
+        <w:t>saja</w:t>
+      </w:r>
+      <w:proofErr w:type="spellEnd"/>
+      <w:r>
+        <w:rPr>
+          <w:lang w:val="en-US"/>
+        </w:rPr>
+        <w:t xml:space="preserve">. </w:t>
+      </w:r>
+      <w:proofErr w:type="spellStart"/>
+      <w:r>
+        <w:rPr>
+          <w:lang w:val="en-US"/>
+        </w:rPr>
+        <w:t>Tgl</w:t>
+      </w:r>
+      <w:proofErr w:type="spellEnd"/>
+      <w:r>
+        <w:rPr>
+          <w:lang w:val="en-US"/>
+        </w:rPr>
+        <w:t>/</w:t>
+      </w:r>
+      <w:proofErr w:type="spellStart"/>
+      <w:r>
+        <w:rPr>
+          <w:lang w:val="en-US"/>
+        </w:rPr>
+        <w:t>Tahun</w:t>
+      </w:r>
+      <w:proofErr w:type="spellEnd"/>
+      <w:r>
+        <w:rPr>
+          <w:lang w:val="en-US"/>
+        </w:rPr>
+        <w:t xml:space="preserve"> </w:t>
+      </w:r>
+      <w:proofErr w:type="spellStart"/>
+      <w:r>
+        <w:rPr>
+          <w:lang w:val="en-US"/>
+        </w:rPr>
+        <w:t>surat</w:t>
+      </w:r>
+      <w:proofErr w:type="spellEnd"/>
+      <w:r>
+        <w:rPr>
+          <w:lang w:val="en-US"/>
+        </w:rPr>
+        <w:t xml:space="preserve"> </w:t>
+      </w:r>
+      <w:proofErr w:type="spellStart"/>
+      <w:r>
+        <w:rPr>
+          <w:lang w:val="en-US"/>
+        </w:rPr>
+        <w:t>menyesuaikan</w:t>
+      </w:r>
+      <w:proofErr w:type="spellEnd"/>
+      <w:r>
+        <w:rPr>
+          <w:lang w:val="en-US"/>
+        </w:rPr>
+        <w:t xml:space="preserve"> </w:t>
+      </w:r>
+      <w:proofErr w:type="spellStart"/>
+      <w:r>
+        <w:rPr>
+          <w:lang w:val="en-US"/>
+        </w:rPr>
+        <w:t>tanggal</w:t>
+      </w:r>
+      <w:proofErr w:type="spellEnd"/>
+      <w:r>
+        <w:rPr>
+          <w:lang w:val="en-US"/>
+        </w:rPr>
+        <w:t xml:space="preserve"> input </w:t>
+      </w:r>
+      <w:proofErr w:type="spellStart"/>
+      <w:r>
+        <w:rPr>
+          <w:lang w:val="en-US"/>
+        </w:rPr>
+        <w:t>pegawai</w:t>
+      </w:r>
+      <w:proofErr w:type="spellEnd"/>
+    </w:p>
+    <w:p>
+      <w:pPr>
+        <w:pStyle w:val="ListParagraph"/>
+        <w:numPr>
+          <w:ilvl w:val="0"/>
+          <w:numId w:val="1"/>
+        </w:numPr>
+        <w:rPr>
+          <w:lang w:val="en-US"/>
+        </w:rPr>
+      </w:pPr>
+      <w:proofErr w:type="spellStart"/>
+      <w:r>
+        <w:rPr>
+          <w:lang w:val="en-US"/>
+        </w:rPr>
         <w:t>Pemenuhan</w:t>
       </w:r>
       <w:proofErr w:type="spellEnd"/>
@@ -4746,6 +4854,7 @@
         <w:rPr>
           <w:lang w:val="en-US"/>
         </w:rPr>
+        <w:lastRenderedPageBreak/>
         <w:t>Kepegawaian</w:t>
       </w:r>
       <w:proofErr w:type="spellEnd"/>
@@ -4772,7 +4881,6 @@
         <w:rPr>
           <w:lang w:val="en-US"/>
         </w:rPr>
-        <w:lastRenderedPageBreak/>
         <w:t>Simpan</w:t>
       </w:r>
       <w:proofErr w:type="spellEnd"/>

</xml_diff>

<commit_message>
Surat Keterangan 90% Done
fix bug : count notif, icon, add file mentah surket
</commit_message>
<xml_diff>
--- a/project/kepegawaian/AddonSimrsmu.docx
+++ b/project/kepegawaian/AddonSimrsmu.docx
@@ -3451,12 +3451,14 @@
           <w:numId w:val="1"/>
         </w:numPr>
         <w:rPr>
-          <w:lang w:val="en-US"/>
-        </w:rPr>
-      </w:pPr>
-      <w:proofErr w:type="spellStart"/>
-      <w:r>
-        <w:rPr>
+          <w:strike/>
+          <w:lang w:val="en-US"/>
+        </w:rPr>
+      </w:pPr>
+      <w:proofErr w:type="spellStart"/>
+      <w:r>
+        <w:rPr>
+          <w:strike/>
           <w:lang w:val="en-US"/>
         </w:rPr>
         <w:t>Penomoran</w:t>
@@ -3464,13 +3466,15 @@
       <w:proofErr w:type="spellEnd"/>
       <w:r>
         <w:rPr>
-          <w:lang w:val="en-US"/>
-        </w:rPr>
-        <w:t xml:space="preserve"> </w:t>
-      </w:r>
-      <w:proofErr w:type="spellStart"/>
-      <w:r>
-        <w:rPr>
+          <w:strike/>
+          <w:lang w:val="en-US"/>
+        </w:rPr>
+        <w:t xml:space="preserve"> </w:t>
+      </w:r>
+      <w:proofErr w:type="spellStart"/>
+      <w:r>
+        <w:rPr>
+          <w:strike/>
           <w:lang w:val="en-US"/>
         </w:rPr>
         <w:t>surat</w:t>
@@ -3478,13 +3482,15 @@
       <w:proofErr w:type="spellEnd"/>
       <w:r>
         <w:rPr>
-          <w:lang w:val="en-US"/>
-        </w:rPr>
-        <w:t xml:space="preserve"> </w:t>
-      </w:r>
-      <w:proofErr w:type="spellStart"/>
-      <w:r>
-        <w:rPr>
+          <w:strike/>
+          <w:lang w:val="en-US"/>
+        </w:rPr>
+        <w:t xml:space="preserve"> </w:t>
+      </w:r>
+      <w:proofErr w:type="spellStart"/>
+      <w:r>
+        <w:rPr>
+          <w:strike/>
           <w:lang w:val="en-US"/>
         </w:rPr>
         <w:t>keterangan</w:t>
@@ -3492,13 +3498,15 @@
       <w:proofErr w:type="spellEnd"/>
       <w:r>
         <w:rPr>
-          <w:lang w:val="en-US"/>
-        </w:rPr>
-        <w:t xml:space="preserve"> </w:t>
-      </w:r>
-      <w:proofErr w:type="spellStart"/>
-      <w:r>
-        <w:rPr>
+          <w:strike/>
+          <w:lang w:val="en-US"/>
+        </w:rPr>
+        <w:t xml:space="preserve"> </w:t>
+      </w:r>
+      <w:proofErr w:type="spellStart"/>
+      <w:r>
+        <w:rPr>
+          <w:strike/>
           <w:lang w:val="en-US"/>
         </w:rPr>
         <w:t>dikosongi</w:t>
@@ -3506,13 +3514,15 @@
       <w:proofErr w:type="spellEnd"/>
       <w:r>
         <w:rPr>
-          <w:lang w:val="en-US"/>
-        </w:rPr>
-        <w:t xml:space="preserve"> </w:t>
-      </w:r>
-      <w:proofErr w:type="spellStart"/>
-      <w:r>
-        <w:rPr>
+          <w:strike/>
+          <w:lang w:val="en-US"/>
+        </w:rPr>
+        <w:t xml:space="preserve"> </w:t>
+      </w:r>
+      <w:proofErr w:type="spellStart"/>
+      <w:r>
+        <w:rPr>
+          <w:strike/>
           <w:lang w:val="en-US"/>
         </w:rPr>
         <w:t>saja</w:t>
@@ -3520,6 +3530,7 @@
       <w:proofErr w:type="spellEnd"/>
       <w:r>
         <w:rPr>
+          <w:strike/>
           <w:lang w:val="en-US"/>
         </w:rPr>
         <w:t xml:space="preserve">. </w:t>
@@ -3527,6 +3538,7 @@
       <w:proofErr w:type="spellStart"/>
       <w:r>
         <w:rPr>
+          <w:strike/>
           <w:lang w:val="en-US"/>
         </w:rPr>
         <w:t>Tgl</w:t>
@@ -3534,6 +3546,7 @@
       <w:proofErr w:type="spellEnd"/>
       <w:r>
         <w:rPr>
+          <w:strike/>
           <w:lang w:val="en-US"/>
         </w:rPr>
         <w:t>/</w:t>
@@ -3541,6 +3554,7 @@
       <w:proofErr w:type="spellStart"/>
       <w:r>
         <w:rPr>
+          <w:strike/>
           <w:lang w:val="en-US"/>
         </w:rPr>
         <w:t>Tahun</w:t>
@@ -3548,13 +3562,15 @@
       <w:proofErr w:type="spellEnd"/>
       <w:r>
         <w:rPr>
-          <w:lang w:val="en-US"/>
-        </w:rPr>
-        <w:t xml:space="preserve"> </w:t>
-      </w:r>
-      <w:proofErr w:type="spellStart"/>
-      <w:r>
-        <w:rPr>
+          <w:strike/>
+          <w:lang w:val="en-US"/>
+        </w:rPr>
+        <w:t xml:space="preserve"> </w:t>
+      </w:r>
+      <w:proofErr w:type="spellStart"/>
+      <w:r>
+        <w:rPr>
+          <w:strike/>
           <w:lang w:val="en-US"/>
         </w:rPr>
         <w:t>surat</w:t>
@@ -3562,13 +3578,15 @@
       <w:proofErr w:type="spellEnd"/>
       <w:r>
         <w:rPr>
-          <w:lang w:val="en-US"/>
-        </w:rPr>
-        <w:t xml:space="preserve"> </w:t>
-      </w:r>
-      <w:proofErr w:type="spellStart"/>
-      <w:r>
-        <w:rPr>
+          <w:strike/>
+          <w:lang w:val="en-US"/>
+        </w:rPr>
+        <w:t xml:space="preserve"> </w:t>
+      </w:r>
+      <w:proofErr w:type="spellStart"/>
+      <w:r>
+        <w:rPr>
+          <w:strike/>
           <w:lang w:val="en-US"/>
         </w:rPr>
         <w:t>menyesuaikan</w:t>
@@ -3576,13 +3594,15 @@
       <w:proofErr w:type="spellEnd"/>
       <w:r>
         <w:rPr>
-          <w:lang w:val="en-US"/>
-        </w:rPr>
-        <w:t xml:space="preserve"> </w:t>
-      </w:r>
-      <w:proofErr w:type="spellStart"/>
-      <w:r>
-        <w:rPr>
+          <w:strike/>
+          <w:lang w:val="en-US"/>
+        </w:rPr>
+        <w:t xml:space="preserve"> </w:t>
+      </w:r>
+      <w:proofErr w:type="spellStart"/>
+      <w:r>
+        <w:rPr>
+          <w:strike/>
           <w:lang w:val="en-US"/>
         </w:rPr>
         <w:t>tanggal</w:t>
@@ -3590,6 +3610,7 @@
       <w:proofErr w:type="spellEnd"/>
       <w:r>
         <w:rPr>
+          <w:strike/>
           <w:lang w:val="en-US"/>
         </w:rPr>
         <w:t xml:space="preserve"> input </w:t>
@@ -3597,6 +3618,7 @@
       <w:proofErr w:type="spellStart"/>
       <w:r>
         <w:rPr>
+          <w:strike/>
           <w:lang w:val="en-US"/>
         </w:rPr>
         <w:t>pegawai</w:t>
@@ -3611,12 +3633,14 @@
           <w:numId w:val="1"/>
         </w:numPr>
         <w:rPr>
-          <w:lang w:val="en-US"/>
-        </w:rPr>
-      </w:pPr>
-      <w:proofErr w:type="spellStart"/>
-      <w:r>
-        <w:rPr>
+          <w:strike/>
+          <w:lang w:val="en-US"/>
+        </w:rPr>
+      </w:pPr>
+      <w:proofErr w:type="spellStart"/>
+      <w:r>
+        <w:rPr>
+          <w:strike/>
           <w:lang w:val="en-US"/>
         </w:rPr>
         <w:t>Pemenuhan</w:t>
@@ -3624,6 +3648,7 @@
       <w:proofErr w:type="spellEnd"/>
       <w:r>
         <w:rPr>
+          <w:strike/>
           <w:lang w:val="en-US"/>
         </w:rPr>
         <w:t xml:space="preserve"> SKP dan </w:t>
@@ -3631,6 +3656,7 @@
       <w:proofErr w:type="spellStart"/>
       <w:r>
         <w:rPr>
+          <w:strike/>
           <w:lang w:val="en-US"/>
         </w:rPr>
         <w:t>Paklaring</w:t>
@@ -3638,13 +3664,15 @@
       <w:proofErr w:type="spellEnd"/>
       <w:r>
         <w:rPr>
-          <w:lang w:val="en-US"/>
-        </w:rPr>
-        <w:t xml:space="preserve"> </w:t>
-      </w:r>
-      <w:proofErr w:type="spellStart"/>
-      <w:r>
-        <w:rPr>
+          <w:strike/>
+          <w:lang w:val="en-US"/>
+        </w:rPr>
+        <w:t xml:space="preserve"> </w:t>
+      </w:r>
+      <w:proofErr w:type="spellStart"/>
+      <w:r>
+        <w:rPr>
+          <w:strike/>
           <w:lang w:val="en-US"/>
         </w:rPr>
         <w:t>memerlukan</w:t>
@@ -3652,9 +3680,1114 @@
       <w:proofErr w:type="spellEnd"/>
       <w:r>
         <w:rPr>
+          <w:strike/>
           <w:lang w:val="en-US"/>
         </w:rPr>
         <w:t xml:space="preserve"> TAT</w:t>
+      </w:r>
+    </w:p>
+    <w:p>
+      <w:pPr>
+        <w:rPr>
+          <w:b/>
+          <w:bCs/>
+          <w:lang w:val="en-US"/>
+        </w:rPr>
+      </w:pPr>
+      <w:r>
+        <w:rPr>
+          <w:b/>
+          <w:bCs/>
+          <w:lang w:val="en-US"/>
+        </w:rPr>
+        <w:t>SURAT KETERANGAN KHUSUS PEMENUHAN SKP</w:t>
+      </w:r>
+    </w:p>
+    <w:p>
+      <w:pPr>
+        <w:pStyle w:val="ListParagraph"/>
+        <w:numPr>
+          <w:ilvl w:val="0"/>
+          <w:numId w:val="1"/>
+        </w:numPr>
+        <w:rPr>
+          <w:b/>
+          <w:bCs/>
+          <w:lang w:val="en-US"/>
+        </w:rPr>
+      </w:pPr>
+      <w:proofErr w:type="spellStart"/>
+      <w:r>
+        <w:rPr>
+          <w:lang w:val="en-US"/>
+        </w:rPr>
+        <w:t>Khusus</w:t>
+      </w:r>
+      <w:proofErr w:type="spellEnd"/>
+      <w:r>
+        <w:rPr>
+          <w:lang w:val="en-US"/>
+        </w:rPr>
+        <w:t xml:space="preserve"> </w:t>
+      </w:r>
+      <w:proofErr w:type="spellStart"/>
+      <w:r>
+        <w:rPr>
+          <w:lang w:val="en-US"/>
+        </w:rPr>
+        <w:t>pemenuhan</w:t>
+      </w:r>
+      <w:proofErr w:type="spellEnd"/>
+      <w:r>
+        <w:rPr>
+          <w:lang w:val="en-US"/>
+        </w:rPr>
+        <w:t xml:space="preserve"> SKP </w:t>
+      </w:r>
+      <w:proofErr w:type="spellStart"/>
+      <w:r>
+        <w:rPr>
+          <w:lang w:val="en-US"/>
+        </w:rPr>
+        <w:t>bisa</w:t>
+      </w:r>
+      <w:proofErr w:type="spellEnd"/>
+      <w:r>
+        <w:rPr>
+          <w:lang w:val="en-US"/>
+        </w:rPr>
+        <w:t xml:space="preserve"> </w:t>
+      </w:r>
+      <w:proofErr w:type="spellStart"/>
+      <w:r>
+        <w:rPr>
+          <w:lang w:val="en-US"/>
+        </w:rPr>
+        <w:t>dimasukkan</w:t>
+      </w:r>
+      <w:proofErr w:type="spellEnd"/>
+      <w:r>
+        <w:rPr>
+          <w:lang w:val="en-US"/>
+        </w:rPr>
+        <w:t xml:space="preserve"> </w:t>
+      </w:r>
+      <w:proofErr w:type="spellStart"/>
+      <w:r>
+        <w:rPr>
+          <w:lang w:val="en-US"/>
+        </w:rPr>
+        <w:t>lebih</w:t>
+      </w:r>
+      <w:proofErr w:type="spellEnd"/>
+      <w:r>
+        <w:rPr>
+          <w:lang w:val="en-US"/>
+        </w:rPr>
+        <w:t xml:space="preserve"> </w:t>
+      </w:r>
+      <w:proofErr w:type="spellStart"/>
+      <w:r>
+        <w:rPr>
+          <w:lang w:val="en-US"/>
+        </w:rPr>
+        <w:t>dari</w:t>
+      </w:r>
+      <w:proofErr w:type="spellEnd"/>
+      <w:r>
+        <w:rPr>
+          <w:lang w:val="en-US"/>
+        </w:rPr>
+        <w:t xml:space="preserve"> 1, </w:t>
+      </w:r>
+      <w:proofErr w:type="spellStart"/>
+      <w:r>
+        <w:rPr>
+          <w:lang w:val="en-US"/>
+        </w:rPr>
+        <w:t>menyesuaikan</w:t>
+      </w:r>
+      <w:proofErr w:type="spellEnd"/>
+      <w:r>
+        <w:rPr>
+          <w:lang w:val="en-US"/>
+        </w:rPr>
+        <w:t xml:space="preserve"> </w:t>
+      </w:r>
+      <w:proofErr w:type="spellStart"/>
+      <w:r>
+        <w:rPr>
+          <w:lang w:val="en-US"/>
+        </w:rPr>
+        <w:t>jumlah</w:t>
+      </w:r>
+      <w:proofErr w:type="spellEnd"/>
+      <w:r>
+        <w:rPr>
+          <w:lang w:val="en-US"/>
+        </w:rPr>
+        <w:t xml:space="preserve"> masa bhakti</w:t>
+      </w:r>
+    </w:p>
+    <w:p>
+      <w:pPr>
+        <w:pStyle w:val="ListParagraph"/>
+        <w:numPr>
+          <w:ilvl w:val="0"/>
+          <w:numId w:val="1"/>
+        </w:numPr>
+        <w:rPr>
+          <w:strike/>
+          <w:lang w:val="en-US"/>
+        </w:rPr>
+      </w:pPr>
+      <w:r>
+        <w:rPr>
+          <w:strike/>
+          <w:lang w:val="en-US"/>
+        </w:rPr>
+        <w:t xml:space="preserve">Ketika </w:t>
+      </w:r>
+      <w:proofErr w:type="spellStart"/>
+      <w:r>
+        <w:rPr>
+          <w:strike/>
+          <w:lang w:val="en-US"/>
+        </w:rPr>
+        <w:t>pegawai</w:t>
+      </w:r>
+      <w:proofErr w:type="spellEnd"/>
+      <w:r>
+        <w:rPr>
+          <w:strike/>
+          <w:lang w:val="en-US"/>
+        </w:rPr>
+        <w:t xml:space="preserve"> </w:t>
+      </w:r>
+      <w:proofErr w:type="spellStart"/>
+      <w:r>
+        <w:rPr>
+          <w:strike/>
+          <w:lang w:val="en-US"/>
+        </w:rPr>
+        <w:t>mengajukan</w:t>
+      </w:r>
+      <w:proofErr w:type="spellEnd"/>
+      <w:r>
+        <w:rPr>
+          <w:strike/>
+          <w:lang w:val="en-US"/>
+        </w:rPr>
+        <w:t xml:space="preserve"> </w:t>
+      </w:r>
+      <w:proofErr w:type="spellStart"/>
+      <w:r>
+        <w:rPr>
+          <w:strike/>
+          <w:lang w:val="en-US"/>
+        </w:rPr>
+        <w:t>pemenuhan</w:t>
+      </w:r>
+      <w:proofErr w:type="spellEnd"/>
+      <w:r>
+        <w:rPr>
+          <w:strike/>
+          <w:lang w:val="en-US"/>
+        </w:rPr>
+        <w:t xml:space="preserve"> SKP, </w:t>
+      </w:r>
+      <w:proofErr w:type="spellStart"/>
+      <w:r>
+        <w:rPr>
+          <w:strike/>
+          <w:lang w:val="en-US"/>
+        </w:rPr>
+        <w:t>muncul</w:t>
+      </w:r>
+      <w:proofErr w:type="spellEnd"/>
+      <w:r>
+        <w:rPr>
+          <w:strike/>
+          <w:lang w:val="en-US"/>
+        </w:rPr>
+        <w:t xml:space="preserve"> </w:t>
+      </w:r>
+      <w:proofErr w:type="spellStart"/>
+      <w:r>
+        <w:rPr>
+          <w:strike/>
+          <w:lang w:val="en-US"/>
+        </w:rPr>
+        <w:t>inputan</w:t>
+      </w:r>
+      <w:proofErr w:type="spellEnd"/>
+      <w:r>
+        <w:rPr>
+          <w:strike/>
+          <w:lang w:val="en-US"/>
+        </w:rPr>
+        <w:t xml:space="preserve"> </w:t>
+      </w:r>
+      <w:proofErr w:type="spellStart"/>
+      <w:r>
+        <w:rPr>
+          <w:strike/>
+          <w:lang w:val="en-US"/>
+        </w:rPr>
+        <w:t>tgl</w:t>
+      </w:r>
+      <w:proofErr w:type="spellEnd"/>
+      <w:r>
+        <w:rPr>
+          <w:strike/>
+          <w:lang w:val="en-US"/>
+        </w:rPr>
+        <w:t xml:space="preserve"> </w:t>
+      </w:r>
+      <w:proofErr w:type="spellStart"/>
+      <w:r>
+        <w:rPr>
+          <w:strike/>
+          <w:lang w:val="en-US"/>
+        </w:rPr>
+        <w:t>periode</w:t>
+      </w:r>
+      <w:proofErr w:type="spellEnd"/>
+      <w:r>
+        <w:rPr>
+          <w:strike/>
+          <w:lang w:val="en-US"/>
+        </w:rPr>
+        <w:t xml:space="preserve"> (DARI SAMPAI)</w:t>
+      </w:r>
+      <w:r>
+        <w:rPr>
+          <w:strike/>
+          <w:lang w:val="en-US"/>
+        </w:rPr>
+        <w:t xml:space="preserve"> / (TGL MULAI KEGIATAN PELAYANAN – TGL AKHIR KEGIATAN PELAYANAN)</w:t>
+      </w:r>
+      <w:r>
+        <w:rPr>
+          <w:strike/>
+          <w:lang w:val="en-US"/>
+        </w:rPr>
+        <w:t xml:space="preserve">, </w:t>
+      </w:r>
+      <w:proofErr w:type="spellStart"/>
+      <w:r>
+        <w:rPr>
+          <w:strike/>
+          <w:lang w:val="en-US"/>
+        </w:rPr>
+        <w:t>inputan</w:t>
+      </w:r>
+      <w:proofErr w:type="spellEnd"/>
+      <w:r>
+        <w:rPr>
+          <w:strike/>
+          <w:lang w:val="en-US"/>
+        </w:rPr>
+        <w:t xml:space="preserve"> TMT </w:t>
+      </w:r>
+      <w:proofErr w:type="spellStart"/>
+      <w:r>
+        <w:rPr>
+          <w:strike/>
+          <w:lang w:val="en-US"/>
+        </w:rPr>
+        <w:t>tidak</w:t>
+      </w:r>
+      <w:proofErr w:type="spellEnd"/>
+      <w:r>
+        <w:rPr>
+          <w:strike/>
+          <w:lang w:val="en-US"/>
+        </w:rPr>
+        <w:t xml:space="preserve"> </w:t>
+      </w:r>
+      <w:proofErr w:type="spellStart"/>
+      <w:r>
+        <w:rPr>
+          <w:strike/>
+          <w:lang w:val="en-US"/>
+        </w:rPr>
+        <w:t>dipakai</w:t>
+      </w:r>
+      <w:proofErr w:type="spellEnd"/>
+    </w:p>
+    <w:p>
+      <w:pPr>
+        <w:pStyle w:val="ListParagraph"/>
+        <w:numPr>
+          <w:ilvl w:val="0"/>
+          <w:numId w:val="1"/>
+        </w:numPr>
+        <w:rPr>
+          <w:strike/>
+          <w:lang w:val="en-US"/>
+        </w:rPr>
+      </w:pPr>
+      <w:proofErr w:type="spellStart"/>
+      <w:r>
+        <w:rPr>
+          <w:strike/>
+          <w:lang w:val="en-US"/>
+        </w:rPr>
+        <w:t>Ditambahkan</w:t>
+      </w:r>
+      <w:proofErr w:type="spellEnd"/>
+      <w:r>
+        <w:rPr>
+          <w:strike/>
+          <w:lang w:val="en-US"/>
+        </w:rPr>
+        <w:t xml:space="preserve"> </w:t>
+      </w:r>
+      <w:proofErr w:type="spellStart"/>
+      <w:r>
+        <w:rPr>
+          <w:strike/>
+          <w:lang w:val="en-US"/>
+        </w:rPr>
+        <w:t>keterangan</w:t>
+      </w:r>
+      <w:proofErr w:type="spellEnd"/>
+      <w:r>
+        <w:rPr>
+          <w:strike/>
+          <w:lang w:val="en-US"/>
+        </w:rPr>
+        <w:t xml:space="preserve"> di input </w:t>
+      </w:r>
+      <w:proofErr w:type="spellStart"/>
+      <w:r>
+        <w:rPr>
+          <w:strike/>
+          <w:lang w:val="en-US"/>
+        </w:rPr>
+        <w:t>tgl</w:t>
+      </w:r>
+      <w:proofErr w:type="spellEnd"/>
+      <w:r>
+        <w:rPr>
+          <w:strike/>
+          <w:lang w:val="en-US"/>
+        </w:rPr>
+        <w:t xml:space="preserve"> = </w:t>
+      </w:r>
+      <w:r>
+        <w:rPr>
+          <w:i/>
+          <w:iCs/>
+          <w:strike/>
+          <w:u w:val="single"/>
+          <w:lang w:val="en-US"/>
+        </w:rPr>
+        <w:t xml:space="preserve">Mohon </w:t>
+      </w:r>
+      <w:proofErr w:type="spellStart"/>
+      <w:r>
+        <w:rPr>
+          <w:i/>
+          <w:iCs/>
+          <w:strike/>
+          <w:u w:val="single"/>
+          <w:lang w:val="en-US"/>
+        </w:rPr>
+        <w:t>memasukkan</w:t>
+      </w:r>
+      <w:proofErr w:type="spellEnd"/>
+      <w:r>
+        <w:rPr>
+          <w:i/>
+          <w:iCs/>
+          <w:strike/>
+          <w:u w:val="single"/>
+          <w:lang w:val="en-US"/>
+        </w:rPr>
+        <w:t xml:space="preserve"> </w:t>
+      </w:r>
+      <w:proofErr w:type="spellStart"/>
+      <w:r>
+        <w:rPr>
+          <w:i/>
+          <w:iCs/>
+          <w:strike/>
+          <w:u w:val="single"/>
+          <w:lang w:val="en-US"/>
+        </w:rPr>
+        <w:t>tanggal</w:t>
+      </w:r>
+      <w:proofErr w:type="spellEnd"/>
+      <w:r>
+        <w:rPr>
+          <w:i/>
+          <w:iCs/>
+          <w:strike/>
+          <w:u w:val="single"/>
+          <w:lang w:val="en-US"/>
+        </w:rPr>
+        <w:t xml:space="preserve"> </w:t>
+      </w:r>
+      <w:proofErr w:type="spellStart"/>
+      <w:r>
+        <w:rPr>
+          <w:i/>
+          <w:iCs/>
+          <w:strike/>
+          <w:u w:val="single"/>
+          <w:lang w:val="en-US"/>
+        </w:rPr>
+        <w:t>menyesuaikan</w:t>
+      </w:r>
+      <w:proofErr w:type="spellEnd"/>
+      <w:r>
+        <w:rPr>
+          <w:i/>
+          <w:iCs/>
+          <w:strike/>
+          <w:u w:val="single"/>
+          <w:lang w:val="en-US"/>
+        </w:rPr>
+        <w:t xml:space="preserve"> </w:t>
+      </w:r>
+      <w:proofErr w:type="spellStart"/>
+      <w:r>
+        <w:rPr>
+          <w:i/>
+          <w:iCs/>
+          <w:strike/>
+          <w:u w:val="single"/>
+          <w:lang w:val="en-US"/>
+        </w:rPr>
+        <w:t>tahun</w:t>
+      </w:r>
+      <w:proofErr w:type="spellEnd"/>
+      <w:r>
+        <w:rPr>
+          <w:i/>
+          <w:iCs/>
+          <w:strike/>
+          <w:u w:val="single"/>
+          <w:lang w:val="en-US"/>
+        </w:rPr>
+        <w:t xml:space="preserve"> </w:t>
+      </w:r>
+      <w:proofErr w:type="spellStart"/>
+      <w:r>
+        <w:rPr>
+          <w:i/>
+          <w:iCs/>
+          <w:strike/>
+          <w:u w:val="single"/>
+          <w:lang w:val="en-US"/>
+        </w:rPr>
+        <w:t>terbit</w:t>
+      </w:r>
+      <w:proofErr w:type="spellEnd"/>
+      <w:r>
+        <w:rPr>
+          <w:i/>
+          <w:iCs/>
+          <w:strike/>
+          <w:u w:val="single"/>
+          <w:lang w:val="en-US"/>
+        </w:rPr>
+        <w:t xml:space="preserve"> SIP Anda</w:t>
+      </w:r>
+    </w:p>
+    <w:p>
+      <w:pPr>
+        <w:rPr>
+          <w:b/>
+          <w:bCs/>
+          <w:lang w:val="en-US"/>
+        </w:rPr>
+      </w:pPr>
+      <w:r>
+        <w:rPr>
+          <w:b/>
+          <w:bCs/>
+          <w:lang w:val="en-US"/>
+        </w:rPr>
+        <w:t>TAMBAHAN PERJALANAN DINAS</w:t>
+      </w:r>
+    </w:p>
+    <w:p>
+      <w:pPr>
+        <w:pStyle w:val="ListParagraph"/>
+        <w:numPr>
+          <w:ilvl w:val="0"/>
+          <w:numId w:val="1"/>
+        </w:numPr>
+        <w:rPr>
+          <w:strike/>
+          <w:lang w:val="en-US"/>
+        </w:rPr>
+      </w:pPr>
+      <w:proofErr w:type="spellStart"/>
+      <w:r>
+        <w:rPr>
+          <w:strike/>
+          <w:lang w:val="en-US"/>
+        </w:rPr>
+        <w:t>Tambah</w:t>
+      </w:r>
+      <w:proofErr w:type="spellEnd"/>
+      <w:r>
+        <w:rPr>
+          <w:strike/>
+          <w:lang w:val="en-US"/>
+        </w:rPr>
+        <w:t xml:space="preserve"> </w:t>
+      </w:r>
+      <w:proofErr w:type="spellStart"/>
+      <w:r>
+        <w:rPr>
+          <w:strike/>
+          <w:lang w:val="en-US"/>
+        </w:rPr>
+        <w:t>pegawai</w:t>
+      </w:r>
+      <w:proofErr w:type="spellEnd"/>
+      <w:r>
+        <w:rPr>
+          <w:strike/>
+          <w:lang w:val="en-US"/>
+        </w:rPr>
+        <w:t xml:space="preserve"> </w:t>
+      </w:r>
+      <w:proofErr w:type="spellStart"/>
+      <w:r>
+        <w:rPr>
+          <w:strike/>
+          <w:lang w:val="en-US"/>
+        </w:rPr>
+        <w:t>siapa</w:t>
+      </w:r>
+      <w:proofErr w:type="spellEnd"/>
+      <w:r>
+        <w:rPr>
+          <w:strike/>
+          <w:lang w:val="en-US"/>
+        </w:rPr>
+        <w:t xml:space="preserve"> yang </w:t>
+      </w:r>
+      <w:proofErr w:type="spellStart"/>
+      <w:r>
+        <w:rPr>
+          <w:strike/>
+          <w:lang w:val="en-US"/>
+        </w:rPr>
+        <w:t>menggunakan</w:t>
+      </w:r>
+      <w:proofErr w:type="spellEnd"/>
+      <w:r>
+        <w:rPr>
+          <w:strike/>
+          <w:lang w:val="en-US"/>
+        </w:rPr>
+        <w:t xml:space="preserve"> </w:t>
+      </w:r>
+      <w:proofErr w:type="spellStart"/>
+      <w:r>
+        <w:rPr>
+          <w:strike/>
+          <w:lang w:val="en-US"/>
+        </w:rPr>
+        <w:t>kendaraan</w:t>
+      </w:r>
+      <w:proofErr w:type="spellEnd"/>
+      <w:r>
+        <w:rPr>
+          <w:strike/>
+          <w:lang w:val="en-US"/>
+        </w:rPr>
+        <w:t xml:space="preserve"> </w:t>
+      </w:r>
+      <w:proofErr w:type="spellStart"/>
+      <w:r>
+        <w:rPr>
+          <w:strike/>
+          <w:lang w:val="en-US"/>
+        </w:rPr>
+        <w:t>tsb</w:t>
+      </w:r>
+      <w:proofErr w:type="spellEnd"/>
+    </w:p>
+    <w:p>
+      <w:pPr>
+        <w:pStyle w:val="ListParagraph"/>
+        <w:numPr>
+          <w:ilvl w:val="0"/>
+          <w:numId w:val="1"/>
+        </w:numPr>
+        <w:rPr>
+          <w:strike/>
+          <w:lang w:val="en-US"/>
+        </w:rPr>
+      </w:pPr>
+      <w:r>
+        <w:rPr>
+          <w:strike/>
+          <w:lang w:val="en-US"/>
+        </w:rPr>
+        <w:t xml:space="preserve">Upload </w:t>
+      </w:r>
+      <w:proofErr w:type="spellStart"/>
+      <w:r>
+        <w:rPr>
+          <w:strike/>
+          <w:lang w:val="en-US"/>
+        </w:rPr>
+        <w:t>dihapus</w:t>
+      </w:r>
+      <w:proofErr w:type="spellEnd"/>
+      <w:r>
+        <w:rPr>
+          <w:strike/>
+          <w:lang w:val="en-US"/>
+        </w:rPr>
+        <w:t xml:space="preserve">, </w:t>
+      </w:r>
+      <w:proofErr w:type="spellStart"/>
+      <w:r>
+        <w:rPr>
+          <w:strike/>
+          <w:lang w:val="en-US"/>
+        </w:rPr>
+        <w:t>perkiraan</w:t>
+      </w:r>
+      <w:proofErr w:type="spellEnd"/>
+      <w:r>
+        <w:rPr>
+          <w:strike/>
+          <w:lang w:val="en-US"/>
+        </w:rPr>
+        <w:t xml:space="preserve"> </w:t>
+      </w:r>
+      <w:proofErr w:type="spellStart"/>
+      <w:r>
+        <w:rPr>
+          <w:strike/>
+          <w:lang w:val="en-US"/>
+        </w:rPr>
+        <w:t>waktu</w:t>
+      </w:r>
+      <w:proofErr w:type="spellEnd"/>
+      <w:r>
+        <w:rPr>
+          <w:strike/>
+          <w:lang w:val="en-US"/>
+        </w:rPr>
+        <w:t xml:space="preserve"> di </w:t>
+      </w:r>
+      <w:proofErr w:type="spellStart"/>
+      <w:r>
+        <w:rPr>
+          <w:strike/>
+          <w:lang w:val="en-US"/>
+        </w:rPr>
+        <w:t>buat</w:t>
+      </w:r>
+      <w:proofErr w:type="spellEnd"/>
+      <w:r>
+        <w:rPr>
+          <w:strike/>
+          <w:lang w:val="en-US"/>
+        </w:rPr>
+        <w:t xml:space="preserve"> optional</w:t>
+      </w:r>
+    </w:p>
+    <w:p>
+      <w:pPr>
+        <w:rPr>
+          <w:b/>
+          <w:bCs/>
+          <w:lang w:val="en-US"/>
+        </w:rPr>
+      </w:pPr>
+      <w:r>
+        <w:rPr>
+          <w:b/>
+          <w:bCs/>
+          <w:lang w:val="en-US"/>
+        </w:rPr>
+        <w:br w:type="page"/>
+      </w:r>
+    </w:p>
+    <w:p>
+      <w:pPr>
+        <w:rPr>
+          <w:b/>
+          <w:bCs/>
+          <w:lang w:val="en-US"/>
+        </w:rPr>
+      </w:pPr>
+      <w:r>
+        <w:rPr>
+          <w:b/>
+          <w:bCs/>
+          <w:lang w:val="en-US"/>
+        </w:rPr>
+        <w:lastRenderedPageBreak/>
+        <w:t>ALUR PERJALANAN DINAS</w:t>
+      </w:r>
+    </w:p>
+    <w:p>
+      <w:pPr>
+        <w:pStyle w:val="ListParagraph"/>
+        <w:numPr>
+          <w:ilvl w:val="0"/>
+          <w:numId w:val="2"/>
+        </w:numPr>
+        <w:rPr>
+          <w:lang w:val="en-US"/>
+        </w:rPr>
+      </w:pPr>
+      <w:proofErr w:type="spellStart"/>
+      <w:r>
+        <w:rPr>
+          <w:lang w:val="en-US"/>
+        </w:rPr>
+        <w:t>Kepegawaian</w:t>
+      </w:r>
+      <w:proofErr w:type="spellEnd"/>
+      <w:r>
+        <w:rPr>
+          <w:lang w:val="en-US"/>
+        </w:rPr>
+        <w:t xml:space="preserve"> input</w:t>
+      </w:r>
+    </w:p>
+    <w:p>
+      <w:pPr>
+        <w:pStyle w:val="ListParagraph"/>
+        <w:numPr>
+          <w:ilvl w:val="0"/>
+          <w:numId w:val="2"/>
+        </w:numPr>
+        <w:rPr>
+          <w:lang w:val="en-US"/>
+        </w:rPr>
+      </w:pPr>
+      <w:proofErr w:type="spellStart"/>
+      <w:r>
+        <w:rPr>
+          <w:lang w:val="en-US"/>
+        </w:rPr>
+        <w:t>Simpan</w:t>
+      </w:r>
+      <w:proofErr w:type="spellEnd"/>
+      <w:r>
+        <w:rPr>
+          <w:lang w:val="en-US"/>
+        </w:rPr>
+        <w:t xml:space="preserve"> (</w:t>
+      </w:r>
+      <w:proofErr w:type="spellStart"/>
+      <w:r>
+        <w:rPr>
+          <w:lang w:val="en-US"/>
+        </w:rPr>
+        <w:t>berstatus</w:t>
+      </w:r>
+      <w:proofErr w:type="spellEnd"/>
+      <w:r>
+        <w:rPr>
+          <w:lang w:val="en-US"/>
+        </w:rPr>
+        <w:t xml:space="preserve"> UNPAID)</w:t>
+      </w:r>
+    </w:p>
+    <w:p>
+      <w:pPr>
+        <w:pStyle w:val="ListParagraph"/>
+        <w:numPr>
+          <w:ilvl w:val="0"/>
+          <w:numId w:val="2"/>
+        </w:numPr>
+        <w:rPr>
+          <w:lang w:val="en-US"/>
+        </w:rPr>
+      </w:pPr>
+      <w:proofErr w:type="spellStart"/>
+      <w:r>
+        <w:rPr>
+          <w:lang w:val="en-US"/>
+        </w:rPr>
+        <w:t>Keuangan</w:t>
+      </w:r>
+      <w:proofErr w:type="spellEnd"/>
+      <w:r>
+        <w:rPr>
+          <w:lang w:val="en-US"/>
+        </w:rPr>
+        <w:t xml:space="preserve"> </w:t>
+      </w:r>
+      <w:proofErr w:type="spellStart"/>
+      <w:r>
+        <w:rPr>
+          <w:lang w:val="en-US"/>
+        </w:rPr>
+        <w:t>klik</w:t>
+      </w:r>
+      <w:proofErr w:type="spellEnd"/>
+      <w:r>
+        <w:rPr>
+          <w:lang w:val="en-US"/>
+        </w:rPr>
+        <w:t xml:space="preserve"> PAIDED (agar </w:t>
+      </w:r>
+      <w:proofErr w:type="spellStart"/>
+      <w:r>
+        <w:rPr>
+          <w:lang w:val="en-US"/>
+        </w:rPr>
+        <w:t>kepegawaian</w:t>
+      </w:r>
+      <w:proofErr w:type="spellEnd"/>
+      <w:r>
+        <w:rPr>
+          <w:lang w:val="en-US"/>
+        </w:rPr>
+        <w:t xml:space="preserve"> juga tau </w:t>
+      </w:r>
+      <w:proofErr w:type="spellStart"/>
+      <w:r>
+        <w:rPr>
+          <w:lang w:val="en-US"/>
+        </w:rPr>
+        <w:t>sudah</w:t>
+      </w:r>
+      <w:proofErr w:type="spellEnd"/>
+      <w:r>
+        <w:rPr>
+          <w:lang w:val="en-US"/>
+        </w:rPr>
+        <w:t xml:space="preserve"> </w:t>
+      </w:r>
+      <w:proofErr w:type="spellStart"/>
+      <w:r>
+        <w:rPr>
+          <w:lang w:val="en-US"/>
+        </w:rPr>
+        <w:t>diberikan</w:t>
+      </w:r>
+      <w:proofErr w:type="spellEnd"/>
+      <w:r>
+        <w:rPr>
+          <w:lang w:val="en-US"/>
+        </w:rPr>
+        <w:t xml:space="preserve"> </w:t>
+      </w:r>
+      <w:proofErr w:type="spellStart"/>
+      <w:r>
+        <w:rPr>
+          <w:lang w:val="en-US"/>
+        </w:rPr>
+        <w:t>uangnya</w:t>
+      </w:r>
+      <w:proofErr w:type="spellEnd"/>
+      <w:r>
+        <w:rPr>
+          <w:lang w:val="en-US"/>
+        </w:rPr>
+        <w:t xml:space="preserve"> </w:t>
+      </w:r>
+      <w:proofErr w:type="spellStart"/>
+      <w:r>
+        <w:rPr>
+          <w:lang w:val="en-US"/>
+        </w:rPr>
+        <w:t>atau</w:t>
+      </w:r>
+      <w:proofErr w:type="spellEnd"/>
+      <w:r>
+        <w:rPr>
+          <w:lang w:val="en-US"/>
+        </w:rPr>
+        <w:t xml:space="preserve"> </w:t>
+      </w:r>
+      <w:proofErr w:type="spellStart"/>
+      <w:r>
+        <w:rPr>
+          <w:lang w:val="en-US"/>
+        </w:rPr>
+        <w:t>belum</w:t>
+      </w:r>
+      <w:proofErr w:type="spellEnd"/>
+      <w:r>
+        <w:rPr>
+          <w:lang w:val="en-US"/>
+        </w:rPr>
+        <w:t>)</w:t>
+      </w:r>
+    </w:p>
+    <w:p>
+      <w:pPr>
+        <w:rPr>
+          <w:lang w:val="en-US"/>
+        </w:rPr>
+      </w:pPr>
+      <w:r>
+        <w:rPr>
+          <w:lang w:val="en-US"/>
+        </w:rPr>
+        <w:t xml:space="preserve">Kalau </w:t>
+      </w:r>
+      <w:proofErr w:type="spellStart"/>
+      <w:r>
+        <w:rPr>
+          <w:lang w:val="en-US"/>
+        </w:rPr>
+        <w:t>sudah</w:t>
+      </w:r>
+      <w:proofErr w:type="spellEnd"/>
+      <w:r>
+        <w:rPr>
+          <w:lang w:val="en-US"/>
+        </w:rPr>
+        <w:t xml:space="preserve"> di </w:t>
+      </w:r>
+      <w:proofErr w:type="spellStart"/>
+      <w:r>
+        <w:rPr>
+          <w:lang w:val="en-US"/>
+        </w:rPr>
+        <w:t>simpan</w:t>
+      </w:r>
+      <w:proofErr w:type="spellEnd"/>
+      <w:r>
+        <w:rPr>
+          <w:lang w:val="en-US"/>
+        </w:rPr>
+        <w:t xml:space="preserve">, </w:t>
+      </w:r>
+      <w:proofErr w:type="spellStart"/>
+      <w:r>
+        <w:rPr>
+          <w:lang w:val="en-US"/>
+        </w:rPr>
+        <w:t>akun</w:t>
+      </w:r>
+      <w:proofErr w:type="spellEnd"/>
+      <w:r>
+        <w:rPr>
+          <w:lang w:val="en-US"/>
+        </w:rPr>
+        <w:t xml:space="preserve"> Cintia dan </w:t>
+      </w:r>
+      <w:r>
+        <w:rPr>
+          <w:lang w:val="en-US"/>
+        </w:rPr>
+        <w:t>Wulan</w:t>
+      </w:r>
+      <w:r>
+        <w:rPr>
+          <w:lang w:val="en-US"/>
+        </w:rPr>
+        <w:t xml:space="preserve"> </w:t>
+      </w:r>
+      <w:proofErr w:type="spellStart"/>
+      <w:r>
+        <w:rPr>
+          <w:lang w:val="en-US"/>
+        </w:rPr>
+        <w:t>dapat</w:t>
+      </w:r>
+      <w:proofErr w:type="spellEnd"/>
+      <w:r>
+        <w:rPr>
+          <w:lang w:val="en-US"/>
+        </w:rPr>
+        <w:t xml:space="preserve"> </w:t>
+      </w:r>
+      <w:proofErr w:type="spellStart"/>
+      <w:r>
+        <w:rPr>
+          <w:lang w:val="en-US"/>
+        </w:rPr>
+        <w:t>melihat</w:t>
+      </w:r>
+      <w:proofErr w:type="spellEnd"/>
+      <w:r>
+        <w:rPr>
+          <w:lang w:val="en-US"/>
+        </w:rPr>
+        <w:t xml:space="preserve"> </w:t>
+      </w:r>
+      <w:proofErr w:type="spellStart"/>
+      <w:r>
+        <w:rPr>
+          <w:lang w:val="en-US"/>
+        </w:rPr>
+        <w:t>perjalanan</w:t>
+      </w:r>
+      <w:proofErr w:type="spellEnd"/>
+      <w:r>
+        <w:rPr>
+          <w:lang w:val="en-US"/>
+        </w:rPr>
+        <w:t xml:space="preserve"> </w:t>
+      </w:r>
+      <w:proofErr w:type="spellStart"/>
+      <w:r>
+        <w:rPr>
+          <w:lang w:val="en-US"/>
+        </w:rPr>
+        <w:t>dinas</w:t>
+      </w:r>
+      <w:proofErr w:type="spellEnd"/>
+      <w:r>
+        <w:rPr>
+          <w:lang w:val="en-US"/>
+        </w:rPr>
+        <w:t xml:space="preserve"> </w:t>
+      </w:r>
+      <w:proofErr w:type="spellStart"/>
+      <w:r>
+        <w:rPr>
+          <w:lang w:val="en-US"/>
+        </w:rPr>
+        <w:t>yg</w:t>
+      </w:r>
+      <w:proofErr w:type="spellEnd"/>
+      <w:r>
+        <w:rPr>
+          <w:lang w:val="en-US"/>
+        </w:rPr>
+        <w:t xml:space="preserve"> </w:t>
+      </w:r>
+      <w:proofErr w:type="spellStart"/>
+      <w:r>
+        <w:rPr>
+          <w:lang w:val="en-US"/>
+        </w:rPr>
+        <w:t>sudah</w:t>
+      </w:r>
+      <w:proofErr w:type="spellEnd"/>
+      <w:r>
+        <w:rPr>
+          <w:lang w:val="en-US"/>
+        </w:rPr>
+        <w:t xml:space="preserve"> </w:t>
+      </w:r>
+      <w:proofErr w:type="spellStart"/>
+      <w:r>
+        <w:rPr>
+          <w:lang w:val="en-US"/>
+        </w:rPr>
+        <w:t>diinput</w:t>
+      </w:r>
+      <w:proofErr w:type="spellEnd"/>
+      <w:r>
+        <w:rPr>
+          <w:lang w:val="en-US"/>
+        </w:rPr>
+        <w:t xml:space="preserve"> (Read Only)</w:t>
       </w:r>
     </w:p>
     <w:p>
@@ -4082,476 +5215,6 @@
           <w:bCs/>
           <w:lang w:val="en-US"/>
         </w:rPr>
-        <w:t>SURAT KETERANGAN KHUSUS PEMENUHAN SKP</w:t>
-      </w:r>
-    </w:p>
-    <w:p>
-      <w:pPr>
-        <w:pStyle w:val="ListParagraph"/>
-        <w:numPr>
-          <w:ilvl w:val="0"/>
-          <w:numId w:val="1"/>
-        </w:numPr>
-        <w:rPr>
-          <w:b/>
-          <w:bCs/>
-          <w:lang w:val="en-US"/>
-        </w:rPr>
-      </w:pPr>
-      <w:proofErr w:type="spellStart"/>
-      <w:r>
-        <w:rPr>
-          <w:lang w:val="en-US"/>
-        </w:rPr>
-        <w:t>Khusus</w:t>
-      </w:r>
-      <w:proofErr w:type="spellEnd"/>
-      <w:r>
-        <w:rPr>
-          <w:lang w:val="en-US"/>
-        </w:rPr>
-        <w:t xml:space="preserve"> </w:t>
-      </w:r>
-      <w:proofErr w:type="spellStart"/>
-      <w:r>
-        <w:rPr>
-          <w:lang w:val="en-US"/>
-        </w:rPr>
-        <w:t>pemenuhan</w:t>
-      </w:r>
-      <w:proofErr w:type="spellEnd"/>
-      <w:r>
-        <w:rPr>
-          <w:lang w:val="en-US"/>
-        </w:rPr>
-        <w:t xml:space="preserve"> SKP </w:t>
-      </w:r>
-      <w:proofErr w:type="spellStart"/>
-      <w:r>
-        <w:rPr>
-          <w:lang w:val="en-US"/>
-        </w:rPr>
-        <w:t>bisa</w:t>
-      </w:r>
-      <w:proofErr w:type="spellEnd"/>
-      <w:r>
-        <w:rPr>
-          <w:lang w:val="en-US"/>
-        </w:rPr>
-        <w:t xml:space="preserve"> </w:t>
-      </w:r>
-      <w:proofErr w:type="spellStart"/>
-      <w:r>
-        <w:rPr>
-          <w:lang w:val="en-US"/>
-        </w:rPr>
-        <w:t>dimasukkan</w:t>
-      </w:r>
-      <w:proofErr w:type="spellEnd"/>
-      <w:r>
-        <w:rPr>
-          <w:lang w:val="en-US"/>
-        </w:rPr>
-        <w:t xml:space="preserve"> </w:t>
-      </w:r>
-      <w:proofErr w:type="spellStart"/>
-      <w:r>
-        <w:rPr>
-          <w:lang w:val="en-US"/>
-        </w:rPr>
-        <w:t>lebih</w:t>
-      </w:r>
-      <w:proofErr w:type="spellEnd"/>
-      <w:r>
-        <w:rPr>
-          <w:lang w:val="en-US"/>
-        </w:rPr>
-        <w:t xml:space="preserve"> </w:t>
-      </w:r>
-      <w:proofErr w:type="spellStart"/>
-      <w:r>
-        <w:rPr>
-          <w:lang w:val="en-US"/>
-        </w:rPr>
-        <w:t>dari</w:t>
-      </w:r>
-      <w:proofErr w:type="spellEnd"/>
-      <w:r>
-        <w:rPr>
-          <w:lang w:val="en-US"/>
-        </w:rPr>
-        <w:t xml:space="preserve"> 1, </w:t>
-      </w:r>
-      <w:proofErr w:type="spellStart"/>
-      <w:r>
-        <w:rPr>
-          <w:lang w:val="en-US"/>
-        </w:rPr>
-        <w:t>menyesuaikan</w:t>
-      </w:r>
-      <w:proofErr w:type="spellEnd"/>
-      <w:r>
-        <w:rPr>
-          <w:lang w:val="en-US"/>
-        </w:rPr>
-        <w:t xml:space="preserve"> </w:t>
-      </w:r>
-      <w:proofErr w:type="spellStart"/>
-      <w:r>
-        <w:rPr>
-          <w:lang w:val="en-US"/>
-        </w:rPr>
-        <w:t>jumlah</w:t>
-      </w:r>
-      <w:proofErr w:type="spellEnd"/>
-      <w:r>
-        <w:rPr>
-          <w:lang w:val="en-US"/>
-        </w:rPr>
-        <w:t xml:space="preserve"> masa bhakti</w:t>
-      </w:r>
-    </w:p>
-    <w:p>
-      <w:pPr>
-        <w:pStyle w:val="ListParagraph"/>
-        <w:numPr>
-          <w:ilvl w:val="0"/>
-          <w:numId w:val="1"/>
-        </w:numPr>
-        <w:rPr>
-          <w:lang w:val="en-US"/>
-        </w:rPr>
-      </w:pPr>
-      <w:r>
-        <w:rPr>
-          <w:lang w:val="en-US"/>
-        </w:rPr>
-        <w:t xml:space="preserve">Ketika </w:t>
-      </w:r>
-      <w:proofErr w:type="spellStart"/>
-      <w:r>
-        <w:rPr>
-          <w:lang w:val="en-US"/>
-        </w:rPr>
-        <w:t>pegawai</w:t>
-      </w:r>
-      <w:proofErr w:type="spellEnd"/>
-      <w:r>
-        <w:rPr>
-          <w:lang w:val="en-US"/>
-        </w:rPr>
-        <w:t xml:space="preserve"> </w:t>
-      </w:r>
-      <w:proofErr w:type="spellStart"/>
-      <w:r>
-        <w:rPr>
-          <w:lang w:val="en-US"/>
-        </w:rPr>
-        <w:t>mengajukan</w:t>
-      </w:r>
-      <w:proofErr w:type="spellEnd"/>
-      <w:r>
-        <w:rPr>
-          <w:lang w:val="en-US"/>
-        </w:rPr>
-        <w:t xml:space="preserve"> </w:t>
-      </w:r>
-      <w:proofErr w:type="spellStart"/>
-      <w:r>
-        <w:rPr>
-          <w:lang w:val="en-US"/>
-        </w:rPr>
-        <w:t>pemenuhan</w:t>
-      </w:r>
-      <w:proofErr w:type="spellEnd"/>
-      <w:r>
-        <w:rPr>
-          <w:lang w:val="en-US"/>
-        </w:rPr>
-        <w:t xml:space="preserve"> SKP, </w:t>
-      </w:r>
-      <w:proofErr w:type="spellStart"/>
-      <w:r>
-        <w:rPr>
-          <w:lang w:val="en-US"/>
-        </w:rPr>
-        <w:t>muncul</w:t>
-      </w:r>
-      <w:proofErr w:type="spellEnd"/>
-      <w:r>
-        <w:rPr>
-          <w:lang w:val="en-US"/>
-        </w:rPr>
-        <w:t xml:space="preserve"> </w:t>
-      </w:r>
-      <w:proofErr w:type="spellStart"/>
-      <w:r>
-        <w:rPr>
-          <w:lang w:val="en-US"/>
-        </w:rPr>
-        <w:t>inputan</w:t>
-      </w:r>
-      <w:proofErr w:type="spellEnd"/>
-      <w:r>
-        <w:rPr>
-          <w:lang w:val="en-US"/>
-        </w:rPr>
-        <w:t xml:space="preserve"> </w:t>
-      </w:r>
-      <w:proofErr w:type="spellStart"/>
-      <w:r>
-        <w:rPr>
-          <w:lang w:val="en-US"/>
-        </w:rPr>
-        <w:t>tgl</w:t>
-      </w:r>
-      <w:proofErr w:type="spellEnd"/>
-      <w:r>
-        <w:rPr>
-          <w:lang w:val="en-US"/>
-        </w:rPr>
-        <w:t xml:space="preserve"> </w:t>
-      </w:r>
-      <w:proofErr w:type="spellStart"/>
-      <w:r>
-        <w:rPr>
-          <w:lang w:val="en-US"/>
-        </w:rPr>
-        <w:t>periode</w:t>
-      </w:r>
-      <w:proofErr w:type="spellEnd"/>
-      <w:r>
-        <w:rPr>
-          <w:lang w:val="en-US"/>
-        </w:rPr>
-        <w:t xml:space="preserve"> (DARI SAMPAI)</w:t>
-      </w:r>
-      <w:r>
-        <w:rPr>
-          <w:lang w:val="en-US"/>
-        </w:rPr>
-        <w:t xml:space="preserve"> / (TGL MULAI KEGIATAN PELAYANAN – TGL AKHIR KEGIATAN PELAYANAN)</w:t>
-      </w:r>
-      <w:r>
-        <w:rPr>
-          <w:lang w:val="en-US"/>
-        </w:rPr>
-        <w:t xml:space="preserve">, </w:t>
-      </w:r>
-      <w:proofErr w:type="spellStart"/>
-      <w:r>
-        <w:rPr>
-          <w:lang w:val="en-US"/>
-        </w:rPr>
-        <w:t>inputan</w:t>
-      </w:r>
-      <w:proofErr w:type="spellEnd"/>
-      <w:r>
-        <w:rPr>
-          <w:lang w:val="en-US"/>
-        </w:rPr>
-        <w:t xml:space="preserve"> TMT </w:t>
-      </w:r>
-      <w:proofErr w:type="spellStart"/>
-      <w:r>
-        <w:rPr>
-          <w:lang w:val="en-US"/>
-        </w:rPr>
-        <w:t>tidak</w:t>
-      </w:r>
-      <w:proofErr w:type="spellEnd"/>
-      <w:r>
-        <w:rPr>
-          <w:lang w:val="en-US"/>
-        </w:rPr>
-        <w:t xml:space="preserve"> </w:t>
-      </w:r>
-      <w:proofErr w:type="spellStart"/>
-      <w:r>
-        <w:rPr>
-          <w:lang w:val="en-US"/>
-        </w:rPr>
-        <w:t>dipakai</w:t>
-      </w:r>
-      <w:proofErr w:type="spellEnd"/>
-    </w:p>
-    <w:p>
-      <w:pPr>
-        <w:pStyle w:val="ListParagraph"/>
-        <w:numPr>
-          <w:ilvl w:val="0"/>
-          <w:numId w:val="1"/>
-        </w:numPr>
-        <w:rPr>
-          <w:lang w:val="en-US"/>
-        </w:rPr>
-      </w:pPr>
-      <w:proofErr w:type="spellStart"/>
-      <w:r>
-        <w:rPr>
-          <w:lang w:val="en-US"/>
-        </w:rPr>
-        <w:t>Ditambahkan</w:t>
-      </w:r>
-      <w:proofErr w:type="spellEnd"/>
-      <w:r>
-        <w:rPr>
-          <w:lang w:val="en-US"/>
-        </w:rPr>
-        <w:t xml:space="preserve"> </w:t>
-      </w:r>
-      <w:proofErr w:type="spellStart"/>
-      <w:r>
-        <w:rPr>
-          <w:lang w:val="en-US"/>
-        </w:rPr>
-        <w:t>keterangan</w:t>
-      </w:r>
-      <w:proofErr w:type="spellEnd"/>
-      <w:r>
-        <w:rPr>
-          <w:lang w:val="en-US"/>
-        </w:rPr>
-        <w:t xml:space="preserve"> di input </w:t>
-      </w:r>
-      <w:proofErr w:type="spellStart"/>
-      <w:r>
-        <w:rPr>
-          <w:lang w:val="en-US"/>
-        </w:rPr>
-        <w:t>tgl</w:t>
-      </w:r>
-      <w:proofErr w:type="spellEnd"/>
-      <w:r>
-        <w:rPr>
-          <w:lang w:val="en-US"/>
-        </w:rPr>
-        <w:t xml:space="preserve"> = </w:t>
-      </w:r>
-      <w:r>
-        <w:rPr>
-          <w:i/>
-          <w:iCs/>
-          <w:u w:val="single"/>
-          <w:lang w:val="en-US"/>
-        </w:rPr>
-        <w:t xml:space="preserve">Mohon </w:t>
-      </w:r>
-      <w:proofErr w:type="spellStart"/>
-      <w:r>
-        <w:rPr>
-          <w:i/>
-          <w:iCs/>
-          <w:u w:val="single"/>
-          <w:lang w:val="en-US"/>
-        </w:rPr>
-        <w:t>memasukkan</w:t>
-      </w:r>
-      <w:proofErr w:type="spellEnd"/>
-      <w:r>
-        <w:rPr>
-          <w:i/>
-          <w:iCs/>
-          <w:u w:val="single"/>
-          <w:lang w:val="en-US"/>
-        </w:rPr>
-        <w:t xml:space="preserve"> </w:t>
-      </w:r>
-      <w:proofErr w:type="spellStart"/>
-      <w:r>
-        <w:rPr>
-          <w:i/>
-          <w:iCs/>
-          <w:u w:val="single"/>
-          <w:lang w:val="en-US"/>
-        </w:rPr>
-        <w:t>tanggal</w:t>
-      </w:r>
-      <w:proofErr w:type="spellEnd"/>
-      <w:r>
-        <w:rPr>
-          <w:i/>
-          <w:iCs/>
-          <w:u w:val="single"/>
-          <w:lang w:val="en-US"/>
-        </w:rPr>
-        <w:t xml:space="preserve"> </w:t>
-      </w:r>
-      <w:proofErr w:type="spellStart"/>
-      <w:r>
-        <w:rPr>
-          <w:i/>
-          <w:iCs/>
-          <w:u w:val="single"/>
-          <w:lang w:val="en-US"/>
-        </w:rPr>
-        <w:t>menyesuaikan</w:t>
-      </w:r>
-      <w:proofErr w:type="spellEnd"/>
-      <w:r>
-        <w:rPr>
-          <w:i/>
-          <w:iCs/>
-          <w:u w:val="single"/>
-          <w:lang w:val="en-US"/>
-        </w:rPr>
-        <w:t xml:space="preserve"> </w:t>
-      </w:r>
-      <w:proofErr w:type="spellStart"/>
-      <w:r>
-        <w:rPr>
-          <w:i/>
-          <w:iCs/>
-          <w:u w:val="single"/>
-          <w:lang w:val="en-US"/>
-        </w:rPr>
-        <w:t>tahun</w:t>
-      </w:r>
-      <w:proofErr w:type="spellEnd"/>
-      <w:r>
-        <w:rPr>
-          <w:i/>
-          <w:iCs/>
-          <w:u w:val="single"/>
-          <w:lang w:val="en-US"/>
-        </w:rPr>
-        <w:t xml:space="preserve"> </w:t>
-      </w:r>
-      <w:proofErr w:type="spellStart"/>
-      <w:r>
-        <w:rPr>
-          <w:i/>
-          <w:iCs/>
-          <w:u w:val="single"/>
-          <w:lang w:val="en-US"/>
-        </w:rPr>
-        <w:t>terbit</w:t>
-      </w:r>
-      <w:proofErr w:type="spellEnd"/>
-      <w:r>
-        <w:rPr>
-          <w:i/>
-          <w:iCs/>
-          <w:u w:val="single"/>
-          <w:lang w:val="en-US"/>
-        </w:rPr>
-        <w:t xml:space="preserve"> SIP Anda</w:t>
-      </w:r>
-    </w:p>
-    <w:p>
-      <w:pPr>
-        <w:rPr>
-          <w:b/>
-          <w:bCs/>
-          <w:lang w:val="en-US"/>
-        </w:rPr>
-      </w:pPr>
-      <w:r>
-        <w:rPr>
-          <w:b/>
-          <w:bCs/>
-          <w:lang w:val="en-US"/>
-        </w:rPr>
         <w:t>ALUR SURAT TUGAS</w:t>
       </w:r>
     </w:p>
@@ -4562,6 +5225,7 @@
           <w:ilvl w:val="0"/>
           <w:numId w:val="3"/>
         </w:numPr>
+        <w:ind w:left="709"/>
         <w:rPr>
           <w:lang w:val="en-US"/>
         </w:rPr>
@@ -4630,6 +5294,7 @@
           <w:ilvl w:val="0"/>
           <w:numId w:val="3"/>
         </w:numPr>
+        <w:ind w:left="709"/>
         <w:rPr>
           <w:lang w:val="en-US"/>
         </w:rPr>
@@ -4647,582 +5312,6 @@
           <w:lang w:val="en-US"/>
         </w:rPr>
         <w:t xml:space="preserve"> &amp; share</w:t>
-      </w:r>
-    </w:p>
-    <w:p>
-      <w:pPr>
-        <w:rPr>
-          <w:b/>
-          <w:bCs/>
-          <w:lang w:val="en-US"/>
-        </w:rPr>
-      </w:pPr>
-      <w:r>
-        <w:rPr>
-          <w:b/>
-          <w:bCs/>
-          <w:lang w:val="en-US"/>
-        </w:rPr>
-        <w:t>TAMBAHAN PERJALANAN DINAS</w:t>
-      </w:r>
-    </w:p>
-    <w:p>
-      <w:pPr>
-        <w:pStyle w:val="ListParagraph"/>
-        <w:numPr>
-          <w:ilvl w:val="0"/>
-          <w:numId w:val="1"/>
-        </w:numPr>
-        <w:rPr>
-          <w:strike/>
-          <w:lang w:val="en-US"/>
-        </w:rPr>
-      </w:pPr>
-      <w:proofErr w:type="spellStart"/>
-      <w:r>
-        <w:rPr>
-          <w:strike/>
-          <w:lang w:val="en-US"/>
-        </w:rPr>
-        <w:t>Tambah</w:t>
-      </w:r>
-      <w:proofErr w:type="spellEnd"/>
-      <w:r>
-        <w:rPr>
-          <w:strike/>
-          <w:lang w:val="en-US"/>
-        </w:rPr>
-        <w:t xml:space="preserve"> </w:t>
-      </w:r>
-      <w:proofErr w:type="spellStart"/>
-      <w:r>
-        <w:rPr>
-          <w:strike/>
-          <w:lang w:val="en-US"/>
-        </w:rPr>
-        <w:t>pegawai</w:t>
-      </w:r>
-      <w:proofErr w:type="spellEnd"/>
-      <w:r>
-        <w:rPr>
-          <w:strike/>
-          <w:lang w:val="en-US"/>
-        </w:rPr>
-        <w:t xml:space="preserve"> </w:t>
-      </w:r>
-      <w:proofErr w:type="spellStart"/>
-      <w:r>
-        <w:rPr>
-          <w:strike/>
-          <w:lang w:val="en-US"/>
-        </w:rPr>
-        <w:t>siapa</w:t>
-      </w:r>
-      <w:proofErr w:type="spellEnd"/>
-      <w:r>
-        <w:rPr>
-          <w:strike/>
-          <w:lang w:val="en-US"/>
-        </w:rPr>
-        <w:t xml:space="preserve"> yang </w:t>
-      </w:r>
-      <w:proofErr w:type="spellStart"/>
-      <w:r>
-        <w:rPr>
-          <w:strike/>
-          <w:lang w:val="en-US"/>
-        </w:rPr>
-        <w:t>menggunakan</w:t>
-      </w:r>
-      <w:proofErr w:type="spellEnd"/>
-      <w:r>
-        <w:rPr>
-          <w:strike/>
-          <w:lang w:val="en-US"/>
-        </w:rPr>
-        <w:t xml:space="preserve"> </w:t>
-      </w:r>
-      <w:proofErr w:type="spellStart"/>
-      <w:r>
-        <w:rPr>
-          <w:strike/>
-          <w:lang w:val="en-US"/>
-        </w:rPr>
-        <w:t>kendaraan</w:t>
-      </w:r>
-      <w:proofErr w:type="spellEnd"/>
-      <w:r>
-        <w:rPr>
-          <w:strike/>
-          <w:lang w:val="en-US"/>
-        </w:rPr>
-        <w:t xml:space="preserve"> </w:t>
-      </w:r>
-      <w:proofErr w:type="spellStart"/>
-      <w:r>
-        <w:rPr>
-          <w:strike/>
-          <w:lang w:val="en-US"/>
-        </w:rPr>
-        <w:t>tsb</w:t>
-      </w:r>
-      <w:proofErr w:type="spellEnd"/>
-    </w:p>
-    <w:p>
-      <w:pPr>
-        <w:pStyle w:val="ListParagraph"/>
-        <w:numPr>
-          <w:ilvl w:val="0"/>
-          <w:numId w:val="1"/>
-        </w:numPr>
-        <w:rPr>
-          <w:strike/>
-          <w:lang w:val="en-US"/>
-        </w:rPr>
-      </w:pPr>
-      <w:r>
-        <w:rPr>
-          <w:strike/>
-          <w:lang w:val="en-US"/>
-        </w:rPr>
-        <w:t xml:space="preserve">Upload </w:t>
-      </w:r>
-      <w:proofErr w:type="spellStart"/>
-      <w:r>
-        <w:rPr>
-          <w:strike/>
-          <w:lang w:val="en-US"/>
-        </w:rPr>
-        <w:t>dihapus</w:t>
-      </w:r>
-      <w:proofErr w:type="spellEnd"/>
-      <w:r>
-        <w:rPr>
-          <w:strike/>
-          <w:lang w:val="en-US"/>
-        </w:rPr>
-        <w:t xml:space="preserve">, </w:t>
-      </w:r>
-      <w:proofErr w:type="spellStart"/>
-      <w:r>
-        <w:rPr>
-          <w:strike/>
-          <w:lang w:val="en-US"/>
-        </w:rPr>
-        <w:t>perkiraan</w:t>
-      </w:r>
-      <w:proofErr w:type="spellEnd"/>
-      <w:r>
-        <w:rPr>
-          <w:strike/>
-          <w:lang w:val="en-US"/>
-        </w:rPr>
-        <w:t xml:space="preserve"> </w:t>
-      </w:r>
-      <w:proofErr w:type="spellStart"/>
-      <w:r>
-        <w:rPr>
-          <w:strike/>
-          <w:lang w:val="en-US"/>
-        </w:rPr>
-        <w:t>waktu</w:t>
-      </w:r>
-      <w:proofErr w:type="spellEnd"/>
-      <w:r>
-        <w:rPr>
-          <w:strike/>
-          <w:lang w:val="en-US"/>
-        </w:rPr>
-        <w:t xml:space="preserve"> di </w:t>
-      </w:r>
-      <w:proofErr w:type="spellStart"/>
-      <w:r>
-        <w:rPr>
-          <w:strike/>
-          <w:lang w:val="en-US"/>
-        </w:rPr>
-        <w:t>buat</w:t>
-      </w:r>
-      <w:proofErr w:type="spellEnd"/>
-      <w:r>
-        <w:rPr>
-          <w:strike/>
-          <w:lang w:val="en-US"/>
-        </w:rPr>
-        <w:t xml:space="preserve"> optional</w:t>
-      </w:r>
-    </w:p>
-    <w:p>
-      <w:pPr>
-        <w:rPr>
-          <w:b/>
-          <w:bCs/>
-          <w:lang w:val="en-US"/>
-        </w:rPr>
-      </w:pPr>
-      <w:r>
-        <w:rPr>
-          <w:b/>
-          <w:bCs/>
-          <w:lang w:val="en-US"/>
-        </w:rPr>
-        <w:t>ALUR PERJALANAN DINAS</w:t>
-      </w:r>
-    </w:p>
-    <w:p>
-      <w:pPr>
-        <w:pStyle w:val="ListParagraph"/>
-        <w:numPr>
-          <w:ilvl w:val="0"/>
-          <w:numId w:val="2"/>
-        </w:numPr>
-        <w:rPr>
-          <w:lang w:val="en-US"/>
-        </w:rPr>
-      </w:pPr>
-      <w:proofErr w:type="spellStart"/>
-      <w:r>
-        <w:rPr>
-          <w:lang w:val="en-US"/>
-        </w:rPr>
-        <w:lastRenderedPageBreak/>
-        <w:t>Kepegawaian</w:t>
-      </w:r>
-      <w:proofErr w:type="spellEnd"/>
-      <w:r>
-        <w:rPr>
-          <w:lang w:val="en-US"/>
-        </w:rPr>
-        <w:t xml:space="preserve"> input</w:t>
-      </w:r>
-    </w:p>
-    <w:p>
-      <w:pPr>
-        <w:pStyle w:val="ListParagraph"/>
-        <w:numPr>
-          <w:ilvl w:val="0"/>
-          <w:numId w:val="2"/>
-        </w:numPr>
-        <w:rPr>
-          <w:lang w:val="en-US"/>
-        </w:rPr>
-      </w:pPr>
-      <w:proofErr w:type="spellStart"/>
-      <w:r>
-        <w:rPr>
-          <w:lang w:val="en-US"/>
-        </w:rPr>
-        <w:t>Simpan</w:t>
-      </w:r>
-      <w:proofErr w:type="spellEnd"/>
-      <w:r>
-        <w:rPr>
-          <w:lang w:val="en-US"/>
-        </w:rPr>
-        <w:t xml:space="preserve"> (</w:t>
-      </w:r>
-      <w:proofErr w:type="spellStart"/>
-      <w:r>
-        <w:rPr>
-          <w:lang w:val="en-US"/>
-        </w:rPr>
-        <w:t>berstatus</w:t>
-      </w:r>
-      <w:proofErr w:type="spellEnd"/>
-      <w:r>
-        <w:rPr>
-          <w:lang w:val="en-US"/>
-        </w:rPr>
-        <w:t xml:space="preserve"> UNPAID)</w:t>
-      </w:r>
-    </w:p>
-    <w:p>
-      <w:pPr>
-        <w:pStyle w:val="ListParagraph"/>
-        <w:numPr>
-          <w:ilvl w:val="0"/>
-          <w:numId w:val="2"/>
-        </w:numPr>
-        <w:rPr>
-          <w:lang w:val="en-US"/>
-        </w:rPr>
-      </w:pPr>
-      <w:proofErr w:type="spellStart"/>
-      <w:r>
-        <w:rPr>
-          <w:lang w:val="en-US"/>
-        </w:rPr>
-        <w:t>Keuangan</w:t>
-      </w:r>
-      <w:proofErr w:type="spellEnd"/>
-      <w:r>
-        <w:rPr>
-          <w:lang w:val="en-US"/>
-        </w:rPr>
-        <w:t xml:space="preserve"> </w:t>
-      </w:r>
-      <w:proofErr w:type="spellStart"/>
-      <w:r>
-        <w:rPr>
-          <w:lang w:val="en-US"/>
-        </w:rPr>
-        <w:t>klik</w:t>
-      </w:r>
-      <w:proofErr w:type="spellEnd"/>
-      <w:r>
-        <w:rPr>
-          <w:lang w:val="en-US"/>
-        </w:rPr>
-        <w:t xml:space="preserve"> PAIDED (agar </w:t>
-      </w:r>
-      <w:proofErr w:type="spellStart"/>
-      <w:r>
-        <w:rPr>
-          <w:lang w:val="en-US"/>
-        </w:rPr>
-        <w:t>kepegawaian</w:t>
-      </w:r>
-      <w:proofErr w:type="spellEnd"/>
-      <w:r>
-        <w:rPr>
-          <w:lang w:val="en-US"/>
-        </w:rPr>
-        <w:t xml:space="preserve"> juga tau </w:t>
-      </w:r>
-      <w:proofErr w:type="spellStart"/>
-      <w:r>
-        <w:rPr>
-          <w:lang w:val="en-US"/>
-        </w:rPr>
-        <w:t>sudah</w:t>
-      </w:r>
-      <w:proofErr w:type="spellEnd"/>
-      <w:r>
-        <w:rPr>
-          <w:lang w:val="en-US"/>
-        </w:rPr>
-        <w:t xml:space="preserve"> </w:t>
-      </w:r>
-      <w:proofErr w:type="spellStart"/>
-      <w:r>
-        <w:rPr>
-          <w:lang w:val="en-US"/>
-        </w:rPr>
-        <w:t>diberikan</w:t>
-      </w:r>
-      <w:proofErr w:type="spellEnd"/>
-      <w:r>
-        <w:rPr>
-          <w:lang w:val="en-US"/>
-        </w:rPr>
-        <w:t xml:space="preserve"> </w:t>
-      </w:r>
-      <w:proofErr w:type="spellStart"/>
-      <w:r>
-        <w:rPr>
-          <w:lang w:val="en-US"/>
-        </w:rPr>
-        <w:t>uangnya</w:t>
-      </w:r>
-      <w:proofErr w:type="spellEnd"/>
-      <w:r>
-        <w:rPr>
-          <w:lang w:val="en-US"/>
-        </w:rPr>
-        <w:t xml:space="preserve"> </w:t>
-      </w:r>
-      <w:proofErr w:type="spellStart"/>
-      <w:r>
-        <w:rPr>
-          <w:lang w:val="en-US"/>
-        </w:rPr>
-        <w:t>atau</w:t>
-      </w:r>
-      <w:proofErr w:type="spellEnd"/>
-      <w:r>
-        <w:rPr>
-          <w:lang w:val="en-US"/>
-        </w:rPr>
-        <w:t xml:space="preserve"> </w:t>
-      </w:r>
-      <w:proofErr w:type="spellStart"/>
-      <w:r>
-        <w:rPr>
-          <w:lang w:val="en-US"/>
-        </w:rPr>
-        <w:t>belum</w:t>
-      </w:r>
-      <w:proofErr w:type="spellEnd"/>
-      <w:r>
-        <w:rPr>
-          <w:lang w:val="en-US"/>
-        </w:rPr>
-        <w:t>)</w:t>
-      </w:r>
-    </w:p>
-    <w:p>
-      <w:pPr>
-        <w:rPr>
-          <w:lang w:val="en-US"/>
-        </w:rPr>
-      </w:pPr>
-      <w:r>
-        <w:rPr>
-          <w:lang w:val="en-US"/>
-        </w:rPr>
-        <w:t xml:space="preserve">Kalau </w:t>
-      </w:r>
-      <w:proofErr w:type="spellStart"/>
-      <w:r>
-        <w:rPr>
-          <w:lang w:val="en-US"/>
-        </w:rPr>
-        <w:t>sudah</w:t>
-      </w:r>
-      <w:proofErr w:type="spellEnd"/>
-      <w:r>
-        <w:rPr>
-          <w:lang w:val="en-US"/>
-        </w:rPr>
-        <w:t xml:space="preserve"> di </w:t>
-      </w:r>
-      <w:proofErr w:type="spellStart"/>
-      <w:r>
-        <w:rPr>
-          <w:lang w:val="en-US"/>
-        </w:rPr>
-        <w:t>simpan</w:t>
-      </w:r>
-      <w:proofErr w:type="spellEnd"/>
-      <w:r>
-        <w:rPr>
-          <w:lang w:val="en-US"/>
-        </w:rPr>
-        <w:t xml:space="preserve">, </w:t>
-      </w:r>
-      <w:proofErr w:type="spellStart"/>
-      <w:r>
-        <w:rPr>
-          <w:lang w:val="en-US"/>
-        </w:rPr>
-        <w:t>akun</w:t>
-      </w:r>
-      <w:proofErr w:type="spellEnd"/>
-      <w:r>
-        <w:rPr>
-          <w:lang w:val="en-US"/>
-        </w:rPr>
-        <w:t xml:space="preserve"> Cintia dan </w:t>
-      </w:r>
-      <w:r>
-        <w:rPr>
-          <w:lang w:val="en-US"/>
-        </w:rPr>
-        <w:t>Wulan</w:t>
-      </w:r>
-      <w:r>
-        <w:rPr>
-          <w:lang w:val="en-US"/>
-        </w:rPr>
-        <w:t xml:space="preserve"> </w:t>
-      </w:r>
-      <w:proofErr w:type="spellStart"/>
-      <w:r>
-        <w:rPr>
-          <w:lang w:val="en-US"/>
-        </w:rPr>
-        <w:t>dapat</w:t>
-      </w:r>
-      <w:proofErr w:type="spellEnd"/>
-      <w:r>
-        <w:rPr>
-          <w:lang w:val="en-US"/>
-        </w:rPr>
-        <w:t xml:space="preserve"> </w:t>
-      </w:r>
-      <w:proofErr w:type="spellStart"/>
-      <w:r>
-        <w:rPr>
-          <w:lang w:val="en-US"/>
-        </w:rPr>
-        <w:t>melihat</w:t>
-      </w:r>
-      <w:proofErr w:type="spellEnd"/>
-      <w:r>
-        <w:rPr>
-          <w:lang w:val="en-US"/>
-        </w:rPr>
-        <w:t xml:space="preserve"> </w:t>
-      </w:r>
-      <w:proofErr w:type="spellStart"/>
-      <w:r>
-        <w:rPr>
-          <w:lang w:val="en-US"/>
-        </w:rPr>
-        <w:t>perjalanan</w:t>
-      </w:r>
-      <w:proofErr w:type="spellEnd"/>
-      <w:r>
-        <w:rPr>
-          <w:lang w:val="en-US"/>
-        </w:rPr>
-        <w:t xml:space="preserve"> </w:t>
-      </w:r>
-      <w:proofErr w:type="spellStart"/>
-      <w:r>
-        <w:rPr>
-          <w:lang w:val="en-US"/>
-        </w:rPr>
-        <w:t>dinas</w:t>
-      </w:r>
-      <w:proofErr w:type="spellEnd"/>
-      <w:r>
-        <w:rPr>
-          <w:lang w:val="en-US"/>
-        </w:rPr>
-        <w:t xml:space="preserve"> </w:t>
-      </w:r>
-      <w:proofErr w:type="spellStart"/>
-      <w:r>
-        <w:rPr>
-          <w:lang w:val="en-US"/>
-        </w:rPr>
-        <w:t>yg</w:t>
-      </w:r>
-      <w:proofErr w:type="spellEnd"/>
-      <w:r>
-        <w:rPr>
-          <w:lang w:val="en-US"/>
-        </w:rPr>
-        <w:t xml:space="preserve"> </w:t>
-      </w:r>
-      <w:proofErr w:type="spellStart"/>
-      <w:r>
-        <w:rPr>
-          <w:lang w:val="en-US"/>
-        </w:rPr>
-        <w:t>sudah</w:t>
-      </w:r>
-      <w:proofErr w:type="spellEnd"/>
-      <w:r>
-        <w:rPr>
-          <w:lang w:val="en-US"/>
-        </w:rPr>
-        <w:t xml:space="preserve"> </w:t>
-      </w:r>
-      <w:proofErr w:type="spellStart"/>
-      <w:r>
-        <w:rPr>
-          <w:lang w:val="en-US"/>
-        </w:rPr>
-        <w:t>diinput</w:t>
-      </w:r>
-      <w:proofErr w:type="spellEnd"/>
-      <w:r>
-        <w:rPr>
-          <w:lang w:val="en-US"/>
-        </w:rPr>
-        <w:t xml:space="preserve"> (Read Only)</w:t>
       </w:r>
     </w:p>
     <w:p>

</xml_diff>

<commit_message>
update revisi 22 jan
AddonSimrsmu
</commit_message>
<xml_diff>
--- a/project/kepegawaian/AddonSimrsmu.docx
+++ b/project/kepegawaian/AddonSimrsmu.docx
@@ -1,6 +1,6 @@
 
 <file path=word/document.xml><?xml version="1.0" encoding="utf-8"?>
-<w:document xmlns:wpc="http://schemas.microsoft.com/office/word/2010/wordprocessingCanvas" xmlns:cx="http://schemas.microsoft.com/office/drawing/2014/chartex" xmlns:cx1="http://schemas.microsoft.com/office/drawing/2015/9/8/chartex" xmlns:cx2="http://schemas.microsoft.com/office/drawing/2015/10/21/chartex" xmlns:cx3="http://schemas.microsoft.com/office/drawing/2016/5/9/chartex" xmlns:cx4="http://schemas.microsoft.com/office/drawing/2016/5/10/chartex" xmlns:cx5="http://schemas.microsoft.com/office/drawing/2016/5/11/chartex" xmlns:cx6="http://schemas.microsoft.com/office/drawing/2016/5/12/chartex" xmlns:cx7="http://schemas.microsoft.com/office/drawing/2016/5/13/chartex" xmlns:cx8="http://schemas.microsoft.com/office/drawing/2016/5/14/chartex" xmlns:mc="http://schemas.openxmlformats.org/markup-compatibility/2006" xmlns:aink="http://schemas.microsoft.com/office/drawing/2016/ink" xmlns:am3d="http://schemas.microsoft.com/office/drawing/2017/model3d" xmlns:o="urn:schemas-microsoft-com:office:office" xmlns:oel="http://schemas.microsoft.com/office/2019/extlst" xmlns:r="http://schemas.openxmlformats.org/officeDocument/2006/relationships" xmlns:m="http://schemas.openxmlformats.org/officeDocument/2006/math" xmlns:v="urn:schemas-microsoft-com:vml" xmlns:wp14="http://schemas.microsoft.com/office/word/2010/wordprocessingDrawing" xmlns:wp="http://schemas.openxmlformats.org/drawingml/2006/wordprocessingDrawing" xmlns:w10="urn:schemas-microsoft-com:office:word" xmlns:w="http://schemas.openxmlformats.org/wordprocessingml/2006/main" xmlns:w14="http://schemas.microsoft.com/office/word/2010/wordml" xmlns:w15="http://schemas.microsoft.com/office/word/2012/wordml" xmlns:w16cex="http://schemas.microsoft.com/office/word/2018/wordml/cex" xmlns:w16cid="http://schemas.microsoft.com/office/word/2016/wordml/cid" xmlns:w16="http://schemas.microsoft.com/office/word/2018/wordml" xmlns:w16sdtdh="http://schemas.microsoft.com/office/word/2020/wordml/sdtdatahash" xmlns:w16se="http://schemas.microsoft.com/office/word/2015/wordml/symex" xmlns:wpg="http://schemas.microsoft.com/office/word/2010/wordprocessingGroup" xmlns:wpi="http://schemas.microsoft.com/office/word/2010/wordprocessingInk" xmlns:wne="http://schemas.microsoft.com/office/word/2006/wordml" xmlns:wps="http://schemas.microsoft.com/office/word/2010/wordprocessingShape" mc:Ignorable="w14 w15 w16se w16cid w16 w16cex w16sdtdh wp14">
+<w:document xmlns:wpc="http://schemas.microsoft.com/office/word/2010/wordprocessingCanvas" xmlns:cx="http://schemas.microsoft.com/office/drawing/2014/chartex" xmlns:cx1="http://schemas.microsoft.com/office/drawing/2015/9/8/chartex" xmlns:cx2="http://schemas.microsoft.com/office/drawing/2015/10/21/chartex" xmlns:cx3="http://schemas.microsoft.com/office/drawing/2016/5/9/chartex" xmlns:cx4="http://schemas.microsoft.com/office/drawing/2016/5/10/chartex" xmlns:cx5="http://schemas.microsoft.com/office/drawing/2016/5/11/chartex" xmlns:cx6="http://schemas.microsoft.com/office/drawing/2016/5/12/chartex" xmlns:cx7="http://schemas.microsoft.com/office/drawing/2016/5/13/chartex" xmlns:cx8="http://schemas.microsoft.com/office/drawing/2016/5/14/chartex" xmlns:mc="http://schemas.openxmlformats.org/markup-compatibility/2006" xmlns:aink="http://schemas.microsoft.com/office/drawing/2016/ink" xmlns:am3d="http://schemas.microsoft.com/office/drawing/2017/model3d" xmlns:o="urn:schemas-microsoft-com:office:office" xmlns:oel="http://schemas.microsoft.com/office/2019/extlst" xmlns:r="http://schemas.openxmlformats.org/officeDocument/2006/relationships" xmlns:m="http://schemas.openxmlformats.org/officeDocument/2006/math" xmlns:v="urn:schemas-microsoft-com:vml" xmlns:wp14="http://schemas.microsoft.com/office/word/2010/wordprocessingDrawing" xmlns:wp="http://schemas.openxmlformats.org/drawingml/2006/wordprocessingDrawing" xmlns:w10="urn:schemas-microsoft-com:office:word" xmlns:w="http://schemas.openxmlformats.org/wordprocessingml/2006/main" xmlns:w14="http://schemas.microsoft.com/office/word/2010/wordml" xmlns:w15="http://schemas.microsoft.com/office/word/2012/wordml" xmlns:w16cex="http://schemas.microsoft.com/office/word/2018/wordml/cex" xmlns:w16cid="http://schemas.microsoft.com/office/word/2016/wordml/cid" xmlns:w16="http://schemas.microsoft.com/office/word/2018/wordml" xmlns:w16du="http://schemas.microsoft.com/office/word/2023/wordml/word16du" xmlns:w16sdtdh="http://schemas.microsoft.com/office/word/2020/wordml/sdtdatahash" xmlns:w16sdtfl="http://schemas.microsoft.com/office/word/2024/wordml/sdtformatlock" xmlns:w16se="http://schemas.microsoft.com/office/word/2015/wordml/symex" xmlns:wpg="http://schemas.microsoft.com/office/word/2010/wordprocessingGroup" xmlns:wpi="http://schemas.microsoft.com/office/word/2010/wordprocessingInk" xmlns:wne="http://schemas.microsoft.com/office/word/2006/wordml" xmlns:wps="http://schemas.microsoft.com/office/word/2010/wordprocessingShape" mc:Ignorable="w14 w15 w16se w16cid w16 w16cex w16sdtdh w16sdtfl w16du wp14">
   <w:body>
     <w:p>
       <w:pPr>
@@ -1320,17 +1320,8 @@
           <w:color w:val="FF0000"/>
           <w:lang w:val="en-US"/>
         </w:rPr>
-        <w:t xml:space="preserve"> Resign per </w:t>
-      </w:r>
-      <w:proofErr w:type="spellStart"/>
-      <w:r>
-        <w:rPr>
-          <w:color w:val="FF0000"/>
-          <w:lang w:val="en-US"/>
-        </w:rPr>
-        <w:t>Bulan</w:t>
-      </w:r>
-      <w:proofErr w:type="spellEnd"/>
+        <w:t xml:space="preserve"> Resign per Bulan</w:t>
+      </w:r>
     </w:p>
     <w:p>
       <w:pPr>
@@ -12238,6 +12229,174 @@
       </w:r>
       <w:proofErr w:type="spellEnd"/>
     </w:p>
+    <w:p>
+      <w:pPr>
+        <w:rPr>
+          <w:lang w:val="en-US"/>
+        </w:rPr>
+      </w:pPr>
+    </w:p>
+    <w:p>
+      <w:pPr>
+        <w:rPr>
+          <w:lang w:val="en-US"/>
+        </w:rPr>
+      </w:pPr>
+      <w:r>
+        <w:rPr>
+          <w:lang w:val="en-US"/>
+        </w:rPr>
+        <w:t>REVISI 22 JAN – TAHAP 3</w:t>
+      </w:r>
+    </w:p>
+    <w:p>
+      <w:pPr>
+        <w:pStyle w:val="ListParagraph"/>
+        <w:numPr>
+          <w:ilvl w:val="0"/>
+          <w:numId w:val="1"/>
+        </w:numPr>
+        <w:rPr>
+          <w:lang w:val="en-US"/>
+        </w:rPr>
+      </w:pPr>
+      <w:r>
+        <w:rPr>
+          <w:lang w:val="en-US"/>
+        </w:rPr>
+        <w:t xml:space="preserve">batas </w:t>
+      </w:r>
+      <w:proofErr w:type="spellStart"/>
+      <w:r>
+        <w:rPr>
+          <w:lang w:val="en-US"/>
+        </w:rPr>
+        <w:t>absen</w:t>
+      </w:r>
+      <w:proofErr w:type="spellEnd"/>
+      <w:r>
+        <w:rPr>
+          <w:lang w:val="en-US"/>
+        </w:rPr>
+        <w:t xml:space="preserve"> </w:t>
+      </w:r>
+      <w:proofErr w:type="spellStart"/>
+      <w:r>
+        <w:rPr>
+          <w:lang w:val="en-US"/>
+        </w:rPr>
+        <w:t>masuk</w:t>
+      </w:r>
+      <w:proofErr w:type="spellEnd"/>
+      <w:r>
+        <w:rPr>
+          <w:lang w:val="en-US"/>
+        </w:rPr>
+        <w:t xml:space="preserve"> H-3 jam </w:t>
+      </w:r>
+      <w:proofErr w:type="spellStart"/>
+      <w:r>
+        <w:rPr>
+          <w:lang w:val="en-US"/>
+        </w:rPr>
+        <w:t>sebelum</w:t>
+      </w:r>
+      <w:proofErr w:type="spellEnd"/>
+      <w:r>
+        <w:rPr>
+          <w:lang w:val="en-US"/>
+        </w:rPr>
+        <w:t xml:space="preserve"> jam </w:t>
+      </w:r>
+      <w:proofErr w:type="spellStart"/>
+      <w:r>
+        <w:rPr>
+          <w:lang w:val="en-US"/>
+        </w:rPr>
+        <w:t>masuk</w:t>
+      </w:r>
+      <w:proofErr w:type="spellEnd"/>
+    </w:p>
+    <w:p>
+      <w:pPr>
+        <w:pStyle w:val="ListParagraph"/>
+        <w:numPr>
+          <w:ilvl w:val="0"/>
+          <w:numId w:val="1"/>
+        </w:numPr>
+        <w:rPr>
+          <w:lang w:val="en-US"/>
+        </w:rPr>
+      </w:pPr>
+      <w:r>
+        <w:rPr>
+          <w:lang w:val="en-US"/>
+        </w:rPr>
+        <w:t xml:space="preserve">Batas </w:t>
+      </w:r>
+      <w:proofErr w:type="spellStart"/>
+      <w:r>
+        <w:rPr>
+          <w:lang w:val="en-US"/>
+        </w:rPr>
+        <w:t>absen</w:t>
+      </w:r>
+      <w:proofErr w:type="spellEnd"/>
+      <w:r>
+        <w:rPr>
+          <w:lang w:val="en-US"/>
+        </w:rPr>
+        <w:t xml:space="preserve"> </w:t>
+      </w:r>
+      <w:proofErr w:type="spellStart"/>
+      <w:r>
+        <w:rPr>
+          <w:lang w:val="en-US"/>
+        </w:rPr>
+        <w:t>pulang</w:t>
+      </w:r>
+      <w:proofErr w:type="spellEnd"/>
+      <w:r>
+        <w:rPr>
+          <w:lang w:val="en-US"/>
+        </w:rPr>
+        <w:t xml:space="preserve"> (user </w:t>
+      </w:r>
+      <w:proofErr w:type="spellStart"/>
+      <w:r>
+        <w:rPr>
+          <w:lang w:val="en-US"/>
+        </w:rPr>
+        <w:t>biasa</w:t>
+      </w:r>
+      <w:proofErr w:type="spellEnd"/>
+      <w:r>
+        <w:rPr>
+          <w:lang w:val="en-US"/>
+        </w:rPr>
+        <w:t xml:space="preserve">) </w:t>
+      </w:r>
+      <w:r>
+        <w:rPr>
+          <w:lang w:val="en-US"/>
+        </w:rPr>
+        <w:t xml:space="preserve">H+3 jam </w:t>
+      </w:r>
+      <w:proofErr w:type="spellStart"/>
+      <w:r>
+        <w:rPr>
+          <w:lang w:val="en-US"/>
+        </w:rPr>
+        <w:t>setelah</w:t>
+      </w:r>
+      <w:proofErr w:type="spellEnd"/>
+      <w:r>
+        <w:rPr>
+          <w:lang w:val="en-US"/>
+        </w:rPr>
+        <w:t xml:space="preserve"> jam pulang</w:t>
+      </w:r>
+    </w:p>
     <w:sectPr>
       <w:pgSz w:w="12240" w:h="15840"/>
       <w:pgMar w:top="1440" w:right="1440" w:bottom="1440" w:left="1440" w:header="708" w:footer="708" w:gutter="0"/>
@@ -12249,7 +12408,7 @@
 </file>
 
 <file path=word/numbering.xml><?xml version="1.0" encoding="utf-8"?>
-<w:numbering xmlns:wpc="http://schemas.microsoft.com/office/word/2010/wordprocessingCanvas" xmlns:cx="http://schemas.microsoft.com/office/drawing/2014/chartex" xmlns:cx1="http://schemas.microsoft.com/office/drawing/2015/9/8/chartex" xmlns:cx2="http://schemas.microsoft.com/office/drawing/2015/10/21/chartex" xmlns:cx3="http://schemas.microsoft.com/office/drawing/2016/5/9/chartex" xmlns:cx4="http://schemas.microsoft.com/office/drawing/2016/5/10/chartex" xmlns:cx5="http://schemas.microsoft.com/office/drawing/2016/5/11/chartex" xmlns:cx6="http://schemas.microsoft.com/office/drawing/2016/5/12/chartex" xmlns:cx7="http://schemas.microsoft.com/office/drawing/2016/5/13/chartex" xmlns:cx8="http://schemas.microsoft.com/office/drawing/2016/5/14/chartex" xmlns:mc="http://schemas.openxmlformats.org/markup-compatibility/2006" xmlns:aink="http://schemas.microsoft.com/office/drawing/2016/ink" xmlns:am3d="http://schemas.microsoft.com/office/drawing/2017/model3d" xmlns:o="urn:schemas-microsoft-com:office:office" xmlns:oel="http://schemas.microsoft.com/office/2019/extlst" xmlns:r="http://schemas.openxmlformats.org/officeDocument/2006/relationships" xmlns:m="http://schemas.openxmlformats.org/officeDocument/2006/math" xmlns:v="urn:schemas-microsoft-com:vml" xmlns:wp14="http://schemas.microsoft.com/office/word/2010/wordprocessingDrawing" xmlns:wp="http://schemas.openxmlformats.org/drawingml/2006/wordprocessingDrawing" xmlns:w10="urn:schemas-microsoft-com:office:word" xmlns:w="http://schemas.openxmlformats.org/wordprocessingml/2006/main" xmlns:w14="http://schemas.microsoft.com/office/word/2010/wordml" xmlns:w15="http://schemas.microsoft.com/office/word/2012/wordml" xmlns:w16cex="http://schemas.microsoft.com/office/word/2018/wordml/cex" xmlns:w16cid="http://schemas.microsoft.com/office/word/2016/wordml/cid" xmlns:w16="http://schemas.microsoft.com/office/word/2018/wordml" xmlns:w16sdtdh="http://schemas.microsoft.com/office/word/2020/wordml/sdtdatahash" xmlns:w16se="http://schemas.microsoft.com/office/word/2015/wordml/symex" xmlns:wpg="http://schemas.microsoft.com/office/word/2010/wordprocessingGroup" xmlns:wpi="http://schemas.microsoft.com/office/word/2010/wordprocessingInk" xmlns:wne="http://schemas.microsoft.com/office/word/2006/wordml" xmlns:wps="http://schemas.microsoft.com/office/word/2010/wordprocessingShape" mc:Ignorable="w14 w15 w16se w16cid w16 w16cex w16sdtdh wp14">
+<w:numbering xmlns:wpc="http://schemas.microsoft.com/office/word/2010/wordprocessingCanvas" xmlns:cx="http://schemas.microsoft.com/office/drawing/2014/chartex" xmlns:cx1="http://schemas.microsoft.com/office/drawing/2015/9/8/chartex" xmlns:cx2="http://schemas.microsoft.com/office/drawing/2015/10/21/chartex" xmlns:cx3="http://schemas.microsoft.com/office/drawing/2016/5/9/chartex" xmlns:cx4="http://schemas.microsoft.com/office/drawing/2016/5/10/chartex" xmlns:cx5="http://schemas.microsoft.com/office/drawing/2016/5/11/chartex" xmlns:cx6="http://schemas.microsoft.com/office/drawing/2016/5/12/chartex" xmlns:cx7="http://schemas.microsoft.com/office/drawing/2016/5/13/chartex" xmlns:cx8="http://schemas.microsoft.com/office/drawing/2016/5/14/chartex" xmlns:mc="http://schemas.openxmlformats.org/markup-compatibility/2006" xmlns:aink="http://schemas.microsoft.com/office/drawing/2016/ink" xmlns:am3d="http://schemas.microsoft.com/office/drawing/2017/model3d" xmlns:o="urn:schemas-microsoft-com:office:office" xmlns:oel="http://schemas.microsoft.com/office/2019/extlst" xmlns:r="http://schemas.openxmlformats.org/officeDocument/2006/relationships" xmlns:m="http://schemas.openxmlformats.org/officeDocument/2006/math" xmlns:v="urn:schemas-microsoft-com:vml" xmlns:wp14="http://schemas.microsoft.com/office/word/2010/wordprocessingDrawing" xmlns:wp="http://schemas.openxmlformats.org/drawingml/2006/wordprocessingDrawing" xmlns:w10="urn:schemas-microsoft-com:office:word" xmlns:w="http://schemas.openxmlformats.org/wordprocessingml/2006/main" xmlns:w14="http://schemas.microsoft.com/office/word/2010/wordml" xmlns:w15="http://schemas.microsoft.com/office/word/2012/wordml" xmlns:w16cex="http://schemas.microsoft.com/office/word/2018/wordml/cex" xmlns:w16cid="http://schemas.microsoft.com/office/word/2016/wordml/cid" xmlns:w16="http://schemas.microsoft.com/office/word/2018/wordml" xmlns:w16du="http://schemas.microsoft.com/office/word/2023/wordml/word16du" xmlns:w16sdtdh="http://schemas.microsoft.com/office/word/2020/wordml/sdtdatahash" xmlns:w16sdtfl="http://schemas.microsoft.com/office/word/2024/wordml/sdtformatlock" xmlns:w16se="http://schemas.microsoft.com/office/word/2015/wordml/symex" xmlns:wpg="http://schemas.microsoft.com/office/word/2010/wordprocessingGroup" xmlns:wpi="http://schemas.microsoft.com/office/word/2010/wordprocessingInk" xmlns:wne="http://schemas.microsoft.com/office/word/2006/wordml" xmlns:wps="http://schemas.microsoft.com/office/word/2010/wordprocessingShape" mc:Ignorable="w14 w15 w16se w16cid w16 w16cex w16sdtdh w16sdtfl w16du wp14">
   <w:abstractNum w:abstractNumId="0" w15:restartNumberingAfterBreak="0">
     <w:nsid w:val="04B96872"/>
     <w:multiLevelType w:val="hybridMultilevel"/>
@@ -13126,7 +13285,7 @@
 </file>
 
 <file path=word/styles.xml><?xml version="1.0" encoding="utf-8"?>
-<w:styles xmlns:mc="http://schemas.openxmlformats.org/markup-compatibility/2006" xmlns:r="http://schemas.openxmlformats.org/officeDocument/2006/relationships" xmlns:w="http://schemas.openxmlformats.org/wordprocessingml/2006/main" xmlns:w14="http://schemas.microsoft.com/office/word/2010/wordml" xmlns:w15="http://schemas.microsoft.com/office/word/2012/wordml" xmlns:w16cex="http://schemas.microsoft.com/office/word/2018/wordml/cex" xmlns:w16cid="http://schemas.microsoft.com/office/word/2016/wordml/cid" xmlns:w16="http://schemas.microsoft.com/office/word/2018/wordml" xmlns:w16sdtdh="http://schemas.microsoft.com/office/word/2020/wordml/sdtdatahash" xmlns:w16se="http://schemas.microsoft.com/office/word/2015/wordml/symex" mc:Ignorable="w14 w15 w16se w16cid w16 w16cex w16sdtdh">
+<w:styles xmlns:mc="http://schemas.openxmlformats.org/markup-compatibility/2006" xmlns:r="http://schemas.openxmlformats.org/officeDocument/2006/relationships" xmlns:w="http://schemas.openxmlformats.org/wordprocessingml/2006/main" xmlns:w14="http://schemas.microsoft.com/office/word/2010/wordml" xmlns:w15="http://schemas.microsoft.com/office/word/2012/wordml" xmlns:w16cex="http://schemas.microsoft.com/office/word/2018/wordml/cex" xmlns:w16cid="http://schemas.microsoft.com/office/word/2016/wordml/cid" xmlns:w16="http://schemas.microsoft.com/office/word/2018/wordml" xmlns:w16du="http://schemas.microsoft.com/office/word/2023/wordml/word16du" xmlns:w16sdtdh="http://schemas.microsoft.com/office/word/2020/wordml/sdtdatahash" xmlns:w16sdtfl="http://schemas.microsoft.com/office/word/2024/wordml/sdtformatlock" xmlns:w16se="http://schemas.microsoft.com/office/word/2015/wordml/symex" mc:Ignorable="w14 w15 w16se w16cid w16 w16cex w16sdtdh w16sdtfl w16du">
   <w:docDefaults>
     <w:rPrDefault>
       <w:rPr>

</xml_diff>